<commit_message>
Atualização 23102026 - gate login fechado
</commit_message>
<xml_diff>
--- a/docs/VTAE_Roadmap.docx
+++ b/docs/VTAE_Roadmap.docx
@@ -2,6 +2,8 @@
 <file path=word/document.xml><?xml version="1.0" encoding="utf-8"?>
 <w:document xmlns:wpc="http://schemas.microsoft.com/office/word/2010/wordprocessingCanvas" xmlns:mc="http://schemas.openxmlformats.org/markup-compatibility/2006" xmlns:o="urn:schemas-microsoft-com:office:office" xmlns:r="http://schemas.openxmlformats.org/officeDocument/2006/relationships" xmlns:m="http://schemas.openxmlformats.org/officeDocument/2006/math" xmlns:v="urn:schemas-microsoft-com:vml" xmlns:wp14="http://schemas.microsoft.com/office/word/2010/wordprocessingDrawing" xmlns:wp="http://schemas.openxmlformats.org/drawingml/2006/wordprocessingDrawing" xmlns:w10="urn:schemas-microsoft-com:office:word" xmlns:w="http://schemas.openxmlformats.org/wordprocessingml/2006/main" xmlns:w14="http://schemas.microsoft.com/office/word/2010/wordml" xmlns:wpg="http://schemas.microsoft.com/office/word/2010/wordprocessingGroup" xmlns:wpi="http://schemas.microsoft.com/office/word/2010/wordprocessingInk" xmlns:wne="http://schemas.microsoft.com/office/word/2006/wordml" xmlns:wps="http://schemas.microsoft.com/office/word/2010/wordprocessingShape" mc:Ignorable="w14 wp14">
   <w:body>
+    <w:bookmarkStart w:id="0" w:name="_GoBack" w:displacedByCustomXml="next"/>
+    <w:bookmarkEnd w:id="0" w:displacedByCustomXml="next"/>
     <w:sdt>
       <w:sdtPr>
         <w:rPr>
@@ -16,6 +18,7 @@
           <w:docPartUnique/>
         </w:docPartObj>
       </w:sdtPr>
+      <w:sdtEndPr/>
       <w:sdtContent>
         <w:p>
           <w:pPr>
@@ -37,7 +40,11 @@
           </w:pPr>
           <w:r>
             <w:fldChar w:fldCharType="begin"/>
+          </w:r>
+          <w:r>
             <w:instrText>TOC \o "1-2" \h \z \u</w:instrText>
+          </w:r>
+          <w:r>
             <w:fldChar w:fldCharType="separate"/>
           </w:r>
           <w:hyperlink w:anchor="_Toc241137390" w:history="1">
@@ -54,10 +61,46 @@
                 <w:webHidden/>
               </w:rPr>
               <w:tab/>
+            </w:r>
+            <w:r>
+              <w:rPr>
+                <w:noProof/>
+                <w:webHidden/>
+              </w:rPr>
               <w:fldChar w:fldCharType="begin"/>
+            </w:r>
+            <w:r>
+              <w:rPr>
+                <w:noProof/>
+                <w:webHidden/>
+              </w:rPr>
               <w:instrText xml:space="preserve"> PAGEREF _Toc241137390 \h </w:instrText>
+            </w:r>
+            <w:r>
+              <w:rPr>
+                <w:noProof/>
+                <w:webHidden/>
+              </w:rPr>
+            </w:r>
+            <w:r>
+              <w:rPr>
+                <w:noProof/>
+                <w:webHidden/>
+              </w:rPr>
               <w:fldChar w:fldCharType="separate"/>
+            </w:r>
+            <w:r>
+              <w:rPr>
+                <w:noProof/>
+                <w:webHidden/>
+              </w:rPr>
               <w:t>1</w:t>
+            </w:r>
+            <w:r>
+              <w:rPr>
+                <w:noProof/>
+                <w:webHidden/>
+              </w:rPr>
               <w:fldChar w:fldCharType="end"/>
             </w:r>
           </w:hyperlink>
@@ -86,10 +129,46 @@
                 <w:webHidden/>
               </w:rPr>
               <w:tab/>
+            </w:r>
+            <w:r>
+              <w:rPr>
+                <w:noProof/>
+                <w:webHidden/>
+              </w:rPr>
               <w:fldChar w:fldCharType="begin"/>
+            </w:r>
+            <w:r>
+              <w:rPr>
+                <w:noProof/>
+                <w:webHidden/>
+              </w:rPr>
               <w:instrText xml:space="preserve"> PAGEREF _Toc241137391 \h </w:instrText>
+            </w:r>
+            <w:r>
+              <w:rPr>
+                <w:noProof/>
+                <w:webHidden/>
+              </w:rPr>
+            </w:r>
+            <w:r>
+              <w:rPr>
+                <w:noProof/>
+                <w:webHidden/>
+              </w:rPr>
               <w:fldChar w:fldCharType="separate"/>
+            </w:r>
+            <w:r>
+              <w:rPr>
+                <w:noProof/>
+                <w:webHidden/>
+              </w:rPr>
               <w:t>1</w:t>
+            </w:r>
+            <w:r>
+              <w:rPr>
+                <w:noProof/>
+                <w:webHidden/>
+              </w:rPr>
               <w:fldChar w:fldCharType="end"/>
             </w:r>
           </w:hyperlink>
@@ -118,10 +197,46 @@
                 <w:webHidden/>
               </w:rPr>
               <w:tab/>
+            </w:r>
+            <w:r>
+              <w:rPr>
+                <w:noProof/>
+                <w:webHidden/>
+              </w:rPr>
               <w:fldChar w:fldCharType="begin"/>
+            </w:r>
+            <w:r>
+              <w:rPr>
+                <w:noProof/>
+                <w:webHidden/>
+              </w:rPr>
               <w:instrText xml:space="preserve"> PAGEREF _Toc241137392 \h </w:instrText>
+            </w:r>
+            <w:r>
+              <w:rPr>
+                <w:noProof/>
+                <w:webHidden/>
+              </w:rPr>
+            </w:r>
+            <w:r>
+              <w:rPr>
+                <w:noProof/>
+                <w:webHidden/>
+              </w:rPr>
               <w:fldChar w:fldCharType="separate"/>
+            </w:r>
+            <w:r>
+              <w:rPr>
+                <w:noProof/>
+                <w:webHidden/>
+              </w:rPr>
               <w:t>2</w:t>
+            </w:r>
+            <w:r>
+              <w:rPr>
+                <w:noProof/>
+                <w:webHidden/>
+              </w:rPr>
               <w:fldChar w:fldCharType="end"/>
             </w:r>
           </w:hyperlink>
@@ -150,10 +265,46 @@
                 <w:webHidden/>
               </w:rPr>
               <w:tab/>
+            </w:r>
+            <w:r>
+              <w:rPr>
+                <w:noProof/>
+                <w:webHidden/>
+              </w:rPr>
               <w:fldChar w:fldCharType="begin"/>
+            </w:r>
+            <w:r>
+              <w:rPr>
+                <w:noProof/>
+                <w:webHidden/>
+              </w:rPr>
               <w:instrText xml:space="preserve"> PAGEREF _Toc241137393 \h </w:instrText>
+            </w:r>
+            <w:r>
+              <w:rPr>
+                <w:noProof/>
+                <w:webHidden/>
+              </w:rPr>
+            </w:r>
+            <w:r>
+              <w:rPr>
+                <w:noProof/>
+                <w:webHidden/>
+              </w:rPr>
               <w:fldChar w:fldCharType="separate"/>
+            </w:r>
+            <w:r>
+              <w:rPr>
+                <w:noProof/>
+                <w:webHidden/>
+              </w:rPr>
               <w:t>2</w:t>
+            </w:r>
+            <w:r>
+              <w:rPr>
+                <w:noProof/>
+                <w:webHidden/>
+              </w:rPr>
               <w:fldChar w:fldCharType="end"/>
             </w:r>
           </w:hyperlink>
@@ -182,10 +333,46 @@
                 <w:webHidden/>
               </w:rPr>
               <w:tab/>
+            </w:r>
+            <w:r>
+              <w:rPr>
+                <w:noProof/>
+                <w:webHidden/>
+              </w:rPr>
               <w:fldChar w:fldCharType="begin"/>
+            </w:r>
+            <w:r>
+              <w:rPr>
+                <w:noProof/>
+                <w:webHidden/>
+              </w:rPr>
               <w:instrText xml:space="preserve"> PAGEREF _Toc241137394 \h </w:instrText>
+            </w:r>
+            <w:r>
+              <w:rPr>
+                <w:noProof/>
+                <w:webHidden/>
+              </w:rPr>
+            </w:r>
+            <w:r>
+              <w:rPr>
+                <w:noProof/>
+                <w:webHidden/>
+              </w:rPr>
               <w:fldChar w:fldCharType="separate"/>
+            </w:r>
+            <w:r>
+              <w:rPr>
+                <w:noProof/>
+                <w:webHidden/>
+              </w:rPr>
               <w:t>2</w:t>
+            </w:r>
+            <w:r>
+              <w:rPr>
+                <w:noProof/>
+                <w:webHidden/>
+              </w:rPr>
               <w:fldChar w:fldCharType="end"/>
             </w:r>
           </w:hyperlink>
@@ -214,10 +401,46 @@
                 <w:webHidden/>
               </w:rPr>
               <w:tab/>
+            </w:r>
+            <w:r>
+              <w:rPr>
+                <w:noProof/>
+                <w:webHidden/>
+              </w:rPr>
               <w:fldChar w:fldCharType="begin"/>
+            </w:r>
+            <w:r>
+              <w:rPr>
+                <w:noProof/>
+                <w:webHidden/>
+              </w:rPr>
               <w:instrText xml:space="preserve"> PAGEREF _Toc241137395 \h </w:instrText>
+            </w:r>
+            <w:r>
+              <w:rPr>
+                <w:noProof/>
+                <w:webHidden/>
+              </w:rPr>
+            </w:r>
+            <w:r>
+              <w:rPr>
+                <w:noProof/>
+                <w:webHidden/>
+              </w:rPr>
               <w:fldChar w:fldCharType="separate"/>
+            </w:r>
+            <w:r>
+              <w:rPr>
+                <w:noProof/>
+                <w:webHidden/>
+              </w:rPr>
               <w:t>3</w:t>
+            </w:r>
+            <w:r>
+              <w:rPr>
+                <w:noProof/>
+                <w:webHidden/>
+              </w:rPr>
               <w:fldChar w:fldCharType="end"/>
             </w:r>
           </w:hyperlink>
@@ -246,10 +469,46 @@
                 <w:webHidden/>
               </w:rPr>
               <w:tab/>
+            </w:r>
+            <w:r>
+              <w:rPr>
+                <w:noProof/>
+                <w:webHidden/>
+              </w:rPr>
               <w:fldChar w:fldCharType="begin"/>
+            </w:r>
+            <w:r>
+              <w:rPr>
+                <w:noProof/>
+                <w:webHidden/>
+              </w:rPr>
               <w:instrText xml:space="preserve"> PAGEREF _Toc241137396 \h </w:instrText>
+            </w:r>
+            <w:r>
+              <w:rPr>
+                <w:noProof/>
+                <w:webHidden/>
+              </w:rPr>
+            </w:r>
+            <w:r>
+              <w:rPr>
+                <w:noProof/>
+                <w:webHidden/>
+              </w:rPr>
               <w:fldChar w:fldCharType="separate"/>
+            </w:r>
+            <w:r>
+              <w:rPr>
+                <w:noProof/>
+                <w:webHidden/>
+              </w:rPr>
               <w:t>3</w:t>
+            </w:r>
+            <w:r>
+              <w:rPr>
+                <w:noProof/>
+                <w:webHidden/>
+              </w:rPr>
               <w:fldChar w:fldCharType="end"/>
             </w:r>
           </w:hyperlink>
@@ -278,10 +537,46 @@
                 <w:webHidden/>
               </w:rPr>
               <w:tab/>
+            </w:r>
+            <w:r>
+              <w:rPr>
+                <w:noProof/>
+                <w:webHidden/>
+              </w:rPr>
               <w:fldChar w:fldCharType="begin"/>
+            </w:r>
+            <w:r>
+              <w:rPr>
+                <w:noProof/>
+                <w:webHidden/>
+              </w:rPr>
               <w:instrText xml:space="preserve"> PAGEREF _Toc241137397 \h </w:instrText>
+            </w:r>
+            <w:r>
+              <w:rPr>
+                <w:noProof/>
+                <w:webHidden/>
+              </w:rPr>
+            </w:r>
+            <w:r>
+              <w:rPr>
+                <w:noProof/>
+                <w:webHidden/>
+              </w:rPr>
               <w:fldChar w:fldCharType="separate"/>
+            </w:r>
+            <w:r>
+              <w:rPr>
+                <w:noProof/>
+                <w:webHidden/>
+              </w:rPr>
               <w:t>4</w:t>
+            </w:r>
+            <w:r>
+              <w:rPr>
+                <w:noProof/>
+                <w:webHidden/>
+              </w:rPr>
               <w:fldChar w:fldCharType="end"/>
             </w:r>
           </w:hyperlink>
@@ -310,10 +605,46 @@
                 <w:webHidden/>
               </w:rPr>
               <w:tab/>
+            </w:r>
+            <w:r>
+              <w:rPr>
+                <w:noProof/>
+                <w:webHidden/>
+              </w:rPr>
               <w:fldChar w:fldCharType="begin"/>
+            </w:r>
+            <w:r>
+              <w:rPr>
+                <w:noProof/>
+                <w:webHidden/>
+              </w:rPr>
               <w:instrText xml:space="preserve"> PAGEREF _Toc241137398 \h </w:instrText>
+            </w:r>
+            <w:r>
+              <w:rPr>
+                <w:noProof/>
+                <w:webHidden/>
+              </w:rPr>
+            </w:r>
+            <w:r>
+              <w:rPr>
+                <w:noProof/>
+                <w:webHidden/>
+              </w:rPr>
               <w:fldChar w:fldCharType="separate"/>
+            </w:r>
+            <w:r>
+              <w:rPr>
+                <w:noProof/>
+                <w:webHidden/>
+              </w:rPr>
               <w:t>4</w:t>
+            </w:r>
+            <w:r>
+              <w:rPr>
+                <w:noProof/>
+                <w:webHidden/>
+              </w:rPr>
               <w:fldChar w:fldCharType="end"/>
             </w:r>
           </w:hyperlink>
@@ -342,10 +673,46 @@
                 <w:webHidden/>
               </w:rPr>
               <w:tab/>
+            </w:r>
+            <w:r>
+              <w:rPr>
+                <w:noProof/>
+                <w:webHidden/>
+              </w:rPr>
               <w:fldChar w:fldCharType="begin"/>
+            </w:r>
+            <w:r>
+              <w:rPr>
+                <w:noProof/>
+                <w:webHidden/>
+              </w:rPr>
               <w:instrText xml:space="preserve"> PAGEREF _Toc241137399 \h </w:instrText>
+            </w:r>
+            <w:r>
+              <w:rPr>
+                <w:noProof/>
+                <w:webHidden/>
+              </w:rPr>
+            </w:r>
+            <w:r>
+              <w:rPr>
+                <w:noProof/>
+                <w:webHidden/>
+              </w:rPr>
               <w:fldChar w:fldCharType="separate"/>
+            </w:r>
+            <w:r>
+              <w:rPr>
+                <w:noProof/>
+                <w:webHidden/>
+              </w:rPr>
               <w:t>4</w:t>
+            </w:r>
+            <w:r>
+              <w:rPr>
+                <w:noProof/>
+                <w:webHidden/>
+              </w:rPr>
               <w:fldChar w:fldCharType="end"/>
             </w:r>
           </w:hyperlink>
@@ -374,10 +741,46 @@
                 <w:webHidden/>
               </w:rPr>
               <w:tab/>
+            </w:r>
+            <w:r>
+              <w:rPr>
+                <w:noProof/>
+                <w:webHidden/>
+              </w:rPr>
               <w:fldChar w:fldCharType="begin"/>
+            </w:r>
+            <w:r>
+              <w:rPr>
+                <w:noProof/>
+                <w:webHidden/>
+              </w:rPr>
               <w:instrText xml:space="preserve"> PAGEREF _Toc241137400 \h </w:instrText>
+            </w:r>
+            <w:r>
+              <w:rPr>
+                <w:noProof/>
+                <w:webHidden/>
+              </w:rPr>
+            </w:r>
+            <w:r>
+              <w:rPr>
+                <w:noProof/>
+                <w:webHidden/>
+              </w:rPr>
               <w:fldChar w:fldCharType="separate"/>
+            </w:r>
+            <w:r>
+              <w:rPr>
+                <w:noProof/>
+                <w:webHidden/>
+              </w:rPr>
               <w:t>5</w:t>
+            </w:r>
+            <w:r>
+              <w:rPr>
+                <w:noProof/>
+                <w:webHidden/>
+              </w:rPr>
               <w:fldChar w:fldCharType="end"/>
             </w:r>
           </w:hyperlink>
@@ -406,10 +809,46 @@
                 <w:webHidden/>
               </w:rPr>
               <w:tab/>
+            </w:r>
+            <w:r>
+              <w:rPr>
+                <w:noProof/>
+                <w:webHidden/>
+              </w:rPr>
               <w:fldChar w:fldCharType="begin"/>
+            </w:r>
+            <w:r>
+              <w:rPr>
+                <w:noProof/>
+                <w:webHidden/>
+              </w:rPr>
               <w:instrText xml:space="preserve"> PAGEREF _Toc241137401 \h </w:instrText>
+            </w:r>
+            <w:r>
+              <w:rPr>
+                <w:noProof/>
+                <w:webHidden/>
+              </w:rPr>
+            </w:r>
+            <w:r>
+              <w:rPr>
+                <w:noProof/>
+                <w:webHidden/>
+              </w:rPr>
               <w:fldChar w:fldCharType="separate"/>
+            </w:r>
+            <w:r>
+              <w:rPr>
+                <w:noProof/>
+                <w:webHidden/>
+              </w:rPr>
               <w:t>5</w:t>
+            </w:r>
+            <w:r>
+              <w:rPr>
+                <w:noProof/>
+                <w:webHidden/>
+              </w:rPr>
               <w:fldChar w:fldCharType="end"/>
             </w:r>
           </w:hyperlink>
@@ -438,10 +877,46 @@
                 <w:webHidden/>
               </w:rPr>
               <w:tab/>
+            </w:r>
+            <w:r>
+              <w:rPr>
+                <w:noProof/>
+                <w:webHidden/>
+              </w:rPr>
               <w:fldChar w:fldCharType="begin"/>
+            </w:r>
+            <w:r>
+              <w:rPr>
+                <w:noProof/>
+                <w:webHidden/>
+              </w:rPr>
               <w:instrText xml:space="preserve"> PAGEREF _Toc241137402 \h </w:instrText>
+            </w:r>
+            <w:r>
+              <w:rPr>
+                <w:noProof/>
+                <w:webHidden/>
+              </w:rPr>
+            </w:r>
+            <w:r>
+              <w:rPr>
+                <w:noProof/>
+                <w:webHidden/>
+              </w:rPr>
               <w:fldChar w:fldCharType="separate"/>
+            </w:r>
+            <w:r>
+              <w:rPr>
+                <w:noProof/>
+                <w:webHidden/>
+              </w:rPr>
               <w:t>6</w:t>
+            </w:r>
+            <w:r>
+              <w:rPr>
+                <w:noProof/>
+                <w:webHidden/>
+              </w:rPr>
               <w:fldChar w:fldCharType="end"/>
             </w:r>
           </w:hyperlink>
@@ -470,10 +945,46 @@
                 <w:webHidden/>
               </w:rPr>
               <w:tab/>
+            </w:r>
+            <w:r>
+              <w:rPr>
+                <w:noProof/>
+                <w:webHidden/>
+              </w:rPr>
               <w:fldChar w:fldCharType="begin"/>
+            </w:r>
+            <w:r>
+              <w:rPr>
+                <w:noProof/>
+                <w:webHidden/>
+              </w:rPr>
               <w:instrText xml:space="preserve"> PAGEREF _Toc241137403 \h </w:instrText>
+            </w:r>
+            <w:r>
+              <w:rPr>
+                <w:noProof/>
+                <w:webHidden/>
+              </w:rPr>
+            </w:r>
+            <w:r>
+              <w:rPr>
+                <w:noProof/>
+                <w:webHidden/>
+              </w:rPr>
               <w:fldChar w:fldCharType="separate"/>
+            </w:r>
+            <w:r>
+              <w:rPr>
+                <w:noProof/>
+                <w:webHidden/>
+              </w:rPr>
               <w:t>6</w:t>
+            </w:r>
+            <w:r>
+              <w:rPr>
+                <w:noProof/>
+                <w:webHidden/>
+              </w:rPr>
               <w:fldChar w:fldCharType="end"/>
             </w:r>
           </w:hyperlink>
@@ -502,10 +1013,46 @@
                 <w:webHidden/>
               </w:rPr>
               <w:tab/>
+            </w:r>
+            <w:r>
+              <w:rPr>
+                <w:noProof/>
+                <w:webHidden/>
+              </w:rPr>
               <w:fldChar w:fldCharType="begin"/>
+            </w:r>
+            <w:r>
+              <w:rPr>
+                <w:noProof/>
+                <w:webHidden/>
+              </w:rPr>
               <w:instrText xml:space="preserve"> PAGEREF _Toc241137404 \h </w:instrText>
+            </w:r>
+            <w:r>
+              <w:rPr>
+                <w:noProof/>
+                <w:webHidden/>
+              </w:rPr>
+            </w:r>
+            <w:r>
+              <w:rPr>
+                <w:noProof/>
+                <w:webHidden/>
+              </w:rPr>
               <w:fldChar w:fldCharType="separate"/>
+            </w:r>
+            <w:r>
+              <w:rPr>
+                <w:noProof/>
+                <w:webHidden/>
+              </w:rPr>
               <w:t>6</w:t>
+            </w:r>
+            <w:r>
+              <w:rPr>
+                <w:noProof/>
+                <w:webHidden/>
+              </w:rPr>
               <w:fldChar w:fldCharType="end"/>
             </w:r>
           </w:hyperlink>
@@ -534,10 +1081,46 @@
                 <w:webHidden/>
               </w:rPr>
               <w:tab/>
+            </w:r>
+            <w:r>
+              <w:rPr>
+                <w:noProof/>
+                <w:webHidden/>
+              </w:rPr>
               <w:fldChar w:fldCharType="begin"/>
+            </w:r>
+            <w:r>
+              <w:rPr>
+                <w:noProof/>
+                <w:webHidden/>
+              </w:rPr>
               <w:instrText xml:space="preserve"> PAGEREF _Toc241137405 \h </w:instrText>
+            </w:r>
+            <w:r>
+              <w:rPr>
+                <w:noProof/>
+                <w:webHidden/>
+              </w:rPr>
+            </w:r>
+            <w:r>
+              <w:rPr>
+                <w:noProof/>
+                <w:webHidden/>
+              </w:rPr>
               <w:fldChar w:fldCharType="separate"/>
+            </w:r>
+            <w:r>
+              <w:rPr>
+                <w:noProof/>
+                <w:webHidden/>
+              </w:rPr>
               <w:t>6</w:t>
+            </w:r>
+            <w:r>
+              <w:rPr>
+                <w:noProof/>
+                <w:webHidden/>
+              </w:rPr>
               <w:fldChar w:fldCharType="end"/>
             </w:r>
           </w:hyperlink>
@@ -566,10 +1149,46 @@
                 <w:webHidden/>
               </w:rPr>
               <w:tab/>
+            </w:r>
+            <w:r>
+              <w:rPr>
+                <w:noProof/>
+                <w:webHidden/>
+              </w:rPr>
               <w:fldChar w:fldCharType="begin"/>
+            </w:r>
+            <w:r>
+              <w:rPr>
+                <w:noProof/>
+                <w:webHidden/>
+              </w:rPr>
               <w:instrText xml:space="preserve"> PAGEREF _Toc241137406 \h </w:instrText>
+            </w:r>
+            <w:r>
+              <w:rPr>
+                <w:noProof/>
+                <w:webHidden/>
+              </w:rPr>
+            </w:r>
+            <w:r>
+              <w:rPr>
+                <w:noProof/>
+                <w:webHidden/>
+              </w:rPr>
               <w:fldChar w:fldCharType="separate"/>
+            </w:r>
+            <w:r>
+              <w:rPr>
+                <w:noProof/>
+                <w:webHidden/>
+              </w:rPr>
               <w:t>6</w:t>
+            </w:r>
+            <w:r>
+              <w:rPr>
+                <w:noProof/>
+                <w:webHidden/>
+              </w:rPr>
               <w:fldChar w:fldCharType="end"/>
             </w:r>
           </w:hyperlink>
@@ -598,10 +1217,46 @@
                 <w:webHidden/>
               </w:rPr>
               <w:tab/>
+            </w:r>
+            <w:r>
+              <w:rPr>
+                <w:noProof/>
+                <w:webHidden/>
+              </w:rPr>
               <w:fldChar w:fldCharType="begin"/>
+            </w:r>
+            <w:r>
+              <w:rPr>
+                <w:noProof/>
+                <w:webHidden/>
+              </w:rPr>
               <w:instrText xml:space="preserve"> PAGEREF _Toc241137407 \h </w:instrText>
+            </w:r>
+            <w:r>
+              <w:rPr>
+                <w:noProof/>
+                <w:webHidden/>
+              </w:rPr>
+            </w:r>
+            <w:r>
+              <w:rPr>
+                <w:noProof/>
+                <w:webHidden/>
+              </w:rPr>
               <w:fldChar w:fldCharType="separate"/>
+            </w:r>
+            <w:r>
+              <w:rPr>
+                <w:noProof/>
+                <w:webHidden/>
+              </w:rPr>
               <w:t>7</w:t>
+            </w:r>
+            <w:r>
+              <w:rPr>
+                <w:noProof/>
+                <w:webHidden/>
+              </w:rPr>
               <w:fldChar w:fldCharType="end"/>
             </w:r>
           </w:hyperlink>
@@ -617,8 +1272,8 @@
       <w:pPr>
         <w:pStyle w:val="Ttulo1"/>
       </w:pPr>
-      <w:bookmarkStart w:id="0" w:name="vtae-roadmap"/>
       <w:bookmarkStart w:id="1" w:name="_Toc241137390"/>
+      <w:bookmarkStart w:id="2" w:name="vtae-roadmap"/>
       <w:r>
         <w:t>VTAE — Roadmap</w:t>
       </w:r>
@@ -646,7 +1301,7 @@
         <w:t>Atualizado:</w:t>
       </w:r>
       <w:r>
-        <w:t xml:space="preserve"> 25/09/2026 </w:t>
+        <w:t xml:space="preserve"> 23/10/2026 </w:t>
       </w:r>
       <w:r>
         <w:rPr>
@@ -706,8 +1361,8 @@
       <w:pPr>
         <w:pStyle w:val="Ttulo2"/>
       </w:pPr>
-      <w:bookmarkStart w:id="2" w:name="onde-estamos"/>
       <w:bookmarkStart w:id="3" w:name="_Toc241137391"/>
+      <w:bookmarkStart w:id="4" w:name="onde-estamos"/>
       <w:r>
         <w:t>Onde estamos</w:t>
       </w:r>
@@ -766,9 +1421,9 @@
       <w:pPr>
         <w:pStyle w:val="Ttulo2"/>
       </w:pPr>
-      <w:bookmarkStart w:id="4" w:name="próximo-passo"/>
       <w:bookmarkStart w:id="5" w:name="_Toc241137392"/>
-      <w:bookmarkEnd w:id="2"/>
+      <w:bookmarkStart w:id="6" w:name="próximo-passo"/>
+      <w:bookmarkEnd w:id="4"/>
       <w:r>
         <w:t>Próximo passo</w:t>
       </w:r>
@@ -779,7 +1434,7 @@
         <w:pStyle w:val="FirstParagraph"/>
       </w:pPr>
       <w:r>
-        <w:t>Primeiro teste (login do SI3) fechado em 25/09 com gate 3/3 limpo; desde 25/09 o gate recusa fechar com degradação. Agora Helio cria sozinho o segundo teste — tela de cadastro (§0.9: preencher, salvar, ler_resultado) — até o gate de 3 execuções. Cada travamento vira correção no manual ou no framework.</w:t>
+        <w:t>Login do sistema de prova migrou para APEX e foi refeito do zero por Helio: gate 3/3 fechado em 23/10. Os testes antigos foram apagados para recomeçar do zero no formato novo. Agora Helio cria sozinho o teste de cadastro, remapeado do zero (§0.9: preencher, salvar, ler_resultado), até o gate de 3 execuções. Cada travamento vira correção no manual ou no framework.</w:t>
       </w:r>
     </w:p>
     <w:p>
@@ -793,9 +1448,9 @@
       <w:pPr>
         <w:pStyle w:val="Ttulo2"/>
       </w:pPr>
-      <w:bookmarkStart w:id="6" w:name="convenções"/>
       <w:bookmarkStart w:id="7" w:name="_Toc241137393"/>
-      <w:bookmarkEnd w:id="4"/>
+      <w:bookmarkStart w:id="8" w:name="convenções"/>
+      <w:bookmarkEnd w:id="6"/>
       <w:r>
         <w:t>Convenções</w:t>
       </w:r>
@@ -810,7 +1465,7 @@
         </w:numPr>
       </w:pPr>
       <w:r>
-        <w:t xml:space="preserve">☑  concluído · ☐ pendente · ⏳ bloqueado por decisão</w:t>
+        <w:t>☑  concluído · ☐ pendente · ⏳ bloqueado por decisão</w:t>
       </w:r>
     </w:p>
     <w:p>
@@ -865,9 +1520,9 @@
       <w:pPr>
         <w:pStyle w:val="Ttulo2"/>
       </w:pPr>
-      <w:bookmarkStart w:id="8" w:name="fase-1-documentação-de-projeto"/>
       <w:bookmarkStart w:id="9" w:name="_Toc241137394"/>
-      <w:bookmarkEnd w:id="6"/>
+      <w:bookmarkStart w:id="10" w:name="fase-1-documentação-de-projeto"/>
+      <w:bookmarkEnd w:id="8"/>
       <w:r>
         <w:t>Fase 1 — Documentação de projeto</w:t>
       </w:r>
@@ -1300,7 +1955,11 @@
               <w:pStyle w:val="Compact"/>
             </w:pPr>
             <w:r>
-              <w:t>☑ 27/08/2026</w:t>
+              <w:t xml:space="preserve">☑ </w:t>
+            </w:r>
+            <w:r>
+              <w:lastRenderedPageBreak/>
+              <w:t>27/08/2026</w:t>
             </w:r>
           </w:p>
         </w:tc>
@@ -1315,12 +1974,11 @@
           <w:b/>
           <w:bCs/>
         </w:rPr>
+        <w:lastRenderedPageBreak/>
         <w:t>Gate — critério de parada:</w:t>
       </w:r>
       <w:r>
-        <w:t xml:space="preserve"> um leitor que não participou das conversas consegue, lendo apenas os quatro documentos, dizer o que o framework é, o que não é, qual o </w:t>
-        <w:lastRenderedPageBreak/>
-        <w:t>próximo passo e como saber se deu certo. Atingido isso, a fase fecha mesmo que haja parágrafos melhoráveis.</w:t>
+        <w:t xml:space="preserve"> um leitor que não participou das conversas consegue, lendo apenas os quatro documentos, dizer o que o framework é, o que não é, qual o próximo passo e como saber se deu certo. Atingido isso, a fase fecha mesmo que haja parágrafos melhoráveis.</w:t>
       </w:r>
     </w:p>
     <w:p>
@@ -1334,9 +1992,9 @@
       <w:pPr>
         <w:pStyle w:val="Ttulo2"/>
       </w:pPr>
-      <w:bookmarkStart w:id="10" w:name="X9d54c1b2113cc110a4933e43fdee364dc696d31"/>
       <w:bookmarkStart w:id="11" w:name="_Toc241137395"/>
-      <w:bookmarkEnd w:id="8"/>
+      <w:bookmarkStart w:id="12" w:name="X9d54c1b2113cc110a4933e43fdee364dc696d31"/>
+      <w:bookmarkEnd w:id="10"/>
       <w:r>
         <w:t>Fase 2 — Formato declarativo + integração contínua básica</w:t>
       </w:r>
@@ -1350,8 +2008,8 @@
       </w:tblPr>
       <w:tblGrid>
         <w:gridCol w:w="531"/>
-        <w:gridCol w:w="5049"/>
-        <w:gridCol w:w="3474"/>
+        <w:gridCol w:w="3291"/>
+        <w:gridCol w:w="5232"/>
       </w:tblGrid>
       <w:tr>
         <w:trPr>
@@ -1516,7 +2174,7 @@
               <w:pStyle w:val="Compact"/>
             </w:pPr>
             <w:r>
-              <w:t xml:space="preserve">◐ 24/09 — abrir, esperar, clicar e teclar viraram verbos (decisão 26); 25/09 — clicar_duas_vezes promovido pelo critério de 3 telas (menu e item médico nas duas admissões)</w:t>
+              <w:t>◐ 24/09 — abrir, esperar, clicar e teclar viraram verbos (decisão 26); 25/09 — clicar_duas_vezes promovido pelo critério de 3 telas (menu e item médico nas duas admissões)</w:t>
             </w:r>
           </w:p>
         </w:tc>
@@ -1639,12 +2297,7 @@
               <w:pStyle w:val="Compact"/>
             </w:pPr>
             <w:r>
-              <w:t xml:space="preserve">☑  </w:t>
-            </w:r>
-            <w:bookmarkStart w:id="12" w:name="_GoBack"/>
-            <w:bookmarkEnd w:id="12"/>
-            <w:r>
-              <w:t>18/08 no Manual de Criação §9 — validar na prática</w:t>
+              <w:t>☑  18/08 no Manual de Criação §9 — validar na prática</w:t>
             </w:r>
           </w:p>
         </w:tc>
@@ -1758,13 +2411,13 @@
       <w:pPr>
         <w:pStyle w:val="Ttulo2"/>
       </w:pPr>
-      <w:bookmarkStart w:id="13" w:name="fase-3-modelo-de-elemento"/>
-      <w:bookmarkStart w:id="14" w:name="_Toc241137396"/>
-      <w:bookmarkEnd w:id="10"/>
+      <w:bookmarkStart w:id="13" w:name="_Toc241137396"/>
+      <w:bookmarkStart w:id="14" w:name="fase-3-modelo-de-elemento"/>
+      <w:bookmarkEnd w:id="12"/>
       <w:r>
         <w:t>Fase 3 — Modelo de Elemento</w:t>
       </w:r>
-      <w:bookmarkEnd w:id="14"/>
+      <w:bookmarkEnd w:id="13"/>
     </w:p>
     <w:tbl>
       <w:tblPr>
@@ -1774,8 +2427,8 @@
       </w:tblPr>
       <w:tblGrid>
         <w:gridCol w:w="531"/>
-        <w:gridCol w:w="5576"/>
-        <w:gridCol w:w="917"/>
+        <w:gridCol w:w="3866"/>
+        <w:gridCol w:w="4657"/>
       </w:tblGrid>
       <w:tr>
         <w:trPr>
@@ -1858,7 +2511,11 @@
               <w:pStyle w:val="Compact"/>
             </w:pPr>
             <w:r>
-              <w:t>☐ evidência 25/09: tela_principal repetido entre login e cadastro</w:t>
+              <w:t xml:space="preserve">☐ evidência 25/09: tela_principal repetido </w:t>
+            </w:r>
+            <w:r>
+              <w:lastRenderedPageBreak/>
+              <w:t>entre login e cadastro</w:t>
             </w:r>
           </w:p>
         </w:tc>
@@ -1873,6 +2530,7 @@
               <w:pStyle w:val="Compact"/>
             </w:pPr>
             <w:r>
+              <w:lastRenderedPageBreak/>
               <w:t>3.2</w:t>
             </w:r>
           </w:p>
@@ -2095,14 +2753,13 @@
       <w:pPr>
         <w:pStyle w:val="Ttulo2"/>
       </w:pPr>
-      <w:bookmarkStart w:id="15" w:name="X326eb80ec4d76c66e9da1488e14ac6921f69714"/>
-      <w:bookmarkStart w:id="16" w:name="_Toc241137397"/>
-      <w:bookmarkEnd w:id="13"/>
-      <w:r>
-        <w:lastRenderedPageBreak/>
+      <w:bookmarkStart w:id="15" w:name="_Toc241137397"/>
+      <w:bookmarkStart w:id="16" w:name="X326eb80ec4d76c66e9da1488e14ac6921f69714"/>
+      <w:bookmarkEnd w:id="14"/>
+      <w:r>
         <w:t>Fase 4 — Vocabulário genérico e desacoplamento do núcleo</w:t>
       </w:r>
-      <w:bookmarkEnd w:id="16"/>
+      <w:bookmarkEnd w:id="15"/>
     </w:p>
     <w:tbl>
       <w:tblPr>
@@ -2112,8 +2769,8 @@
       </w:tblPr>
       <w:tblGrid>
         <w:gridCol w:w="531"/>
-        <w:gridCol w:w="4630"/>
-        <w:gridCol w:w="917"/>
+        <w:gridCol w:w="4069"/>
+        <w:gridCol w:w="4454"/>
       </w:tblGrid>
       <w:tr>
         <w:trPr>
@@ -2278,7 +2935,7 @@
               <w:pStyle w:val="Compact"/>
             </w:pPr>
             <w:r>
-              <w:t xml:space="preserve">◐ salvar sem mecânica fixa (24/09); falta seleção</w:t>
+              <w:t>◐ salvar sem mecânica fixa (24/09); falta seleção</w:t>
             </w:r>
           </w:p>
         </w:tc>
@@ -2556,13 +3213,13 @@
       <w:pPr>
         <w:pStyle w:val="Ttulo2"/>
       </w:pPr>
-      <w:bookmarkStart w:id="17" w:name="Xe524cf1ebf788ce8d45f1fe81c259c6dcda9290"/>
-      <w:bookmarkStart w:id="18" w:name="_Toc241137398"/>
-      <w:bookmarkEnd w:id="15"/>
+      <w:bookmarkStart w:id="17" w:name="_Toc241137398"/>
+      <w:bookmarkStart w:id="18" w:name="Xe524cf1ebf788ce8d45f1fe81c259c6dcda9290"/>
+      <w:bookmarkEnd w:id="16"/>
       <w:r>
         <w:t>Fase 5 — Primeiros testes nas duas bancadas + feedback</w:t>
       </w:r>
-      <w:bookmarkEnd w:id="18"/>
+      <w:bookmarkEnd w:id="17"/>
     </w:p>
     <w:tbl>
       <w:tblPr>
@@ -2671,6 +3328,7 @@
               <w:pStyle w:val="Compact"/>
             </w:pPr>
             <w:r>
+              <w:lastRenderedPageBreak/>
               <w:t>5.2</w:t>
             </w:r>
           </w:p>
@@ -2852,13 +3510,13 @@
       <w:pPr>
         <w:pStyle w:val="Ttulo2"/>
       </w:pPr>
-      <w:bookmarkStart w:id="19" w:name="fase-6-autonomia-completa"/>
-      <w:bookmarkStart w:id="20" w:name="_Toc241137399"/>
-      <w:bookmarkEnd w:id="17"/>
+      <w:bookmarkStart w:id="19" w:name="_Toc241137399"/>
+      <w:bookmarkStart w:id="20" w:name="fase-6-autonomia-completa"/>
+      <w:bookmarkEnd w:id="18"/>
       <w:r>
         <w:t>Fase 6 — Autonomia completa</w:t>
       </w:r>
-      <w:bookmarkEnd w:id="20"/>
+      <w:bookmarkEnd w:id="19"/>
     </w:p>
     <w:tbl>
       <w:tblPr>
@@ -3172,7 +3830,6 @@
           <w:b/>
           <w:bCs/>
         </w:rPr>
-        <w:lastRenderedPageBreak/>
         <w:t>Gate:</w:t>
       </w:r>
       <w:r>
@@ -3190,13 +3847,13 @@
       <w:pPr>
         <w:pStyle w:val="Ttulo2"/>
       </w:pPr>
-      <w:bookmarkStart w:id="21" w:name="trilhas-paralelas"/>
-      <w:bookmarkStart w:id="22" w:name="_Toc241137400"/>
-      <w:bookmarkEnd w:id="19"/>
+      <w:bookmarkStart w:id="21" w:name="_Toc241137400"/>
+      <w:bookmarkStart w:id="22" w:name="trilhas-paralelas"/>
+      <w:bookmarkEnd w:id="20"/>
       <w:r>
         <w:t>Trilhas paralelas</w:t>
       </w:r>
-      <w:bookmarkEnd w:id="22"/>
+      <w:bookmarkEnd w:id="21"/>
     </w:p>
     <w:p>
       <w:pPr>
@@ -3527,6 +4184,7 @@
           <w:b/>
           <w:bCs/>
         </w:rPr>
+        <w:lastRenderedPageBreak/>
         <w:t>Limite:</w:t>
       </w:r>
       <w:r>
@@ -3544,14 +4202,14 @@
       <w:pPr>
         <w:pStyle w:val="Ttulo2"/>
       </w:pPr>
-      <w:bookmarkStart w:id="25" w:name="bancadas"/>
-      <w:bookmarkStart w:id="26" w:name="_Toc241137401"/>
-      <w:bookmarkEnd w:id="21"/>
+      <w:bookmarkStart w:id="25" w:name="_Toc241137401"/>
+      <w:bookmarkStart w:id="26" w:name="bancadas"/>
+      <w:bookmarkEnd w:id="22"/>
       <w:bookmarkEnd w:id="24"/>
       <w:r>
         <w:t>Bancadas</w:t>
       </w:r>
-      <w:bookmarkEnd w:id="26"/>
+      <w:bookmarkEnd w:id="25"/>
     </w:p>
     <w:tbl>
       <w:tblPr>
@@ -3560,9 +4218,9 @@
         <w:tblLook w:val="0020" w:firstRow="1" w:lastRow="0" w:firstColumn="0" w:lastColumn="0" w:noHBand="0" w:noVBand="0"/>
       </w:tblPr>
       <w:tblGrid>
-        <w:gridCol w:w="1360"/>
-        <w:gridCol w:w="3476"/>
-        <w:gridCol w:w="3251"/>
+        <w:gridCol w:w="1265"/>
+        <w:gridCol w:w="2757"/>
+        <w:gridCol w:w="5032"/>
       </w:tblGrid>
       <w:tr>
         <w:trPr>
@@ -3632,20 +4290,20 @@
               <w:pStyle w:val="Compact"/>
             </w:pPr>
             <w:r>
-              <w:t>CadastroMin</w:t>
-            </w:r>
-          </w:p>
-        </w:tc>
-        <w:tc>
-          <w:tcPr>
-            <w:tcW w:w="0" w:type="auto"/>
-          </w:tcPr>
-          <w:p>
-            <w:pPr>
-              <w:pStyle w:val="Compact"/>
-            </w:pPr>
-            <w:r>
-              <w:t>Existe e funciona</w:t>
+              <w:t>A definir</w:t>
+            </w:r>
+          </w:p>
+        </w:tc>
+        <w:tc>
+          <w:tcPr>
+            <w:tcW w:w="0" w:type="auto"/>
+          </w:tcPr>
+          <w:p>
+            <w:pPr>
+              <w:pStyle w:val="Compact"/>
+            </w:pPr>
+            <w:r>
+              <w:t>Piloto CadastroMin removido em 23/10 — testes refeitos do zero</w:t>
             </w:r>
           </w:p>
         </w:tc>
@@ -3819,14 +4477,13 @@
       <w:pPr>
         <w:pStyle w:val="Ttulo2"/>
       </w:pPr>
-      <w:bookmarkStart w:id="27" w:name="decisões-pendentes"/>
-      <w:bookmarkStart w:id="28" w:name="_Toc241137402"/>
-      <w:bookmarkEnd w:id="25"/>
-      <w:r>
-        <w:lastRenderedPageBreak/>
+      <w:bookmarkStart w:id="27" w:name="_Toc241137402"/>
+      <w:bookmarkStart w:id="28" w:name="decisões-pendentes"/>
+      <w:bookmarkEnd w:id="26"/>
+      <w:r>
         <w:t>Decisões pendentes</w:t>
       </w:r>
-      <w:bookmarkEnd w:id="28"/>
+      <w:bookmarkEnd w:id="27"/>
     </w:p>
     <w:tbl>
       <w:tblPr>
@@ -3978,13 +4635,13 @@
       <w:pPr>
         <w:pStyle w:val="Ttulo2"/>
       </w:pPr>
-      <w:bookmarkStart w:id="29" w:name="decisões-resolvidas"/>
-      <w:bookmarkStart w:id="30" w:name="_Toc241137403"/>
-      <w:bookmarkEnd w:id="27"/>
+      <w:bookmarkStart w:id="29" w:name="_Toc241137403"/>
+      <w:bookmarkStart w:id="30" w:name="decisões-resolvidas"/>
+      <w:bookmarkEnd w:id="28"/>
       <w:r>
         <w:t>Decisões resolvidas</w:t>
       </w:r>
-      <w:bookmarkEnd w:id="30"/>
+      <w:bookmarkEnd w:id="29"/>
     </w:p>
     <w:tbl>
       <w:tblPr>
@@ -3994,8 +4651,8 @@
       </w:tblPr>
       <w:tblGrid>
         <w:gridCol w:w="482"/>
-        <w:gridCol w:w="2144"/>
-        <w:gridCol w:w="4913"/>
+        <w:gridCol w:w="2018"/>
+        <w:gridCol w:w="5039"/>
         <w:gridCol w:w="1515"/>
       </w:tblGrid>
       <w:tr>
@@ -4174,46 +4831,51 @@
               <w:pStyle w:val="Compact"/>
             </w:pPr>
             <w:r>
-              <w:t xml:space="preserve">26</w:t>
-            </w:r>
-          </w:p>
-        </w:tc>
-        <w:tc>
-          <w:tcPr>
-            <w:tcW w:w="0" w:type="auto"/>
-          </w:tcPr>
-          <w:p>
-            <w:pPr>
-              <w:pStyle w:val="Compact"/>
-            </w:pPr>
-            <w:r>
-              <w:t xml:space="preserve">Criação de teste sem ajuda, em qualquer sistema</w:t>
-            </w:r>
-          </w:p>
-        </w:tc>
-        <w:tc>
-          <w:tcPr>
-            <w:tcW w:w="0" w:type="auto"/>
-          </w:tcPr>
-          <w:p>
-            <w:pPr>
-              <w:pStyle w:val="Compact"/>
-            </w:pPr>
-            <w:r>
-              <w:t xml:space="preserve">Verbos genéricos no roteiro (abrir, esperar, clicar, teclar); salvar por botão ou tecla; campo sigiloso; {dado:x}; vtae executar e vtae mapear; camada exata (pyjab) opcional. Manual de Criação v3 com a aula do zero ao gate (§0)</w:t>
-            </w:r>
-          </w:p>
-        </w:tc>
-        <w:tc>
-          <w:tcPr>
-            <w:tcW w:w="0" w:type="auto"/>
-          </w:tcPr>
-          <w:p>
-            <w:pPr>
-              <w:pStyle w:val="Compact"/>
-            </w:pPr>
-            <w:r>
-              <w:t xml:space="preserve">24/09/2026</w:t>
+              <w:t>26</w:t>
+            </w:r>
+          </w:p>
+        </w:tc>
+        <w:tc>
+          <w:tcPr>
+            <w:tcW w:w="0" w:type="auto"/>
+          </w:tcPr>
+          <w:p>
+            <w:pPr>
+              <w:pStyle w:val="Compact"/>
+            </w:pPr>
+            <w:r>
+              <w:t>Criação de teste sem ajuda, em qualquer sistema</w:t>
+            </w:r>
+          </w:p>
+        </w:tc>
+        <w:tc>
+          <w:tcPr>
+            <w:tcW w:w="0" w:type="auto"/>
+          </w:tcPr>
+          <w:p>
+            <w:pPr>
+              <w:pStyle w:val="Compact"/>
+            </w:pPr>
+            <w:r>
+              <w:t xml:space="preserve">Verbos genéricos no roteiro (abrir, esperar, clicar, teclar); salvar por botão ou tecla; campo sigiloso; {dado:x}; vtae executar e vtae mapear; </w:t>
+            </w:r>
+            <w:r>
+              <w:lastRenderedPageBreak/>
+              <w:t>camada exata (pyjab) opcional. Manual de Criação v3 com a aula do zero ao gate (§0)</w:t>
+            </w:r>
+          </w:p>
+        </w:tc>
+        <w:tc>
+          <w:tcPr>
+            <w:tcW w:w="0" w:type="auto"/>
+          </w:tcPr>
+          <w:p>
+            <w:pPr>
+              <w:pStyle w:val="Compact"/>
+            </w:pPr>
+            <w:r>
+              <w:lastRenderedPageBreak/>
+              <w:t>24/09/2026</w:t>
             </w:r>
           </w:p>
         </w:tc>
@@ -4221,6 +4883,7 @@
     </w:tbl>
     <w:p>
       <w:r>
+        <w:lastRenderedPageBreak/>
         <w:pict>
           <v:rect id="_x0000_i1038" style="width:0;height:1.5pt" o:hralign="center" o:hrstd="t" o:hr="t"/>
         </w:pict>
@@ -4230,13 +4893,13 @@
       <w:pPr>
         <w:pStyle w:val="Ttulo2"/>
       </w:pPr>
-      <w:bookmarkStart w:id="31" w:name="dívida-técnica-registrada"/>
-      <w:bookmarkStart w:id="32" w:name="_Toc241137404"/>
-      <w:bookmarkEnd w:id="29"/>
+      <w:bookmarkStart w:id="31" w:name="_Toc241137404"/>
+      <w:bookmarkStart w:id="32" w:name="dívida-técnica-registrada"/>
+      <w:bookmarkEnd w:id="30"/>
       <w:r>
         <w:t>Dívida técnica registrada</w:t>
       </w:r>
-      <w:bookmarkEnd w:id="32"/>
+      <w:bookmarkEnd w:id="31"/>
     </w:p>
     <w:tbl>
       <w:tblPr>
@@ -4245,10 +4908,10 @@
         <w:tblLook w:val="0020" w:firstRow="1" w:lastRow="0" w:firstColumn="0" w:lastColumn="0" w:noHBand="0" w:noVBand="0"/>
       </w:tblPr>
       <w:tblGrid>
-        <w:gridCol w:w="2708"/>
-        <w:gridCol w:w="2490"/>
-        <w:gridCol w:w="1934"/>
-        <w:gridCol w:w="1922"/>
+        <w:gridCol w:w="3249"/>
+        <w:gridCol w:w="1961"/>
+        <w:gridCol w:w="2044"/>
+        <w:gridCol w:w="1800"/>
       </w:tblGrid>
       <w:tr>
         <w:trPr>
@@ -4372,46 +5035,46 @@
               <w:pStyle w:val="Compact"/>
             </w:pPr>
             <w:r>
-              <w:t xml:space="preserve">teclar e abrir sem execução em tela real (mapear, clicar, esperar e preencher validados em 25/09)</w:t>
-            </w:r>
-          </w:p>
-        </w:tc>
-        <w:tc>
-          <w:tcPr>
-            <w:tcW w:w="0" w:type="auto"/>
-          </w:tcPr>
-          <w:p>
-            <w:pPr>
-              <w:pStyle w:val="Compact"/>
-            </w:pPr>
-            <w:r>
-              <w:t xml:space="preserve">Decisão 26</w:t>
-            </w:r>
-          </w:p>
-        </w:tc>
-        <w:tc>
-          <w:tcPr>
-            <w:tcW w:w="0" w:type="auto"/>
-          </w:tcPr>
-          <w:p>
-            <w:pPr>
-              <w:pStyle w:val="Compact"/>
-            </w:pPr>
-            <w:r>
-              <w:t xml:space="preserve">Pode falhar no primeiro uso real</w:t>
-            </w:r>
-          </w:p>
-        </w:tc>
-        <w:tc>
-          <w:tcPr>
-            <w:tcW w:w="0" w:type="auto"/>
-          </w:tcPr>
-          <w:p>
-            <w:pPr>
-              <w:pStyle w:val="Compact"/>
-            </w:pPr>
-            <w:r>
-              <w:t xml:space="preserve">Primeiro teste do §0</w:t>
+              <w:t>teclar e abrir sem execução em tela real (mapear, clicar, esperar e preencher validados em 25/09)</w:t>
+            </w:r>
+          </w:p>
+        </w:tc>
+        <w:tc>
+          <w:tcPr>
+            <w:tcW w:w="0" w:type="auto"/>
+          </w:tcPr>
+          <w:p>
+            <w:pPr>
+              <w:pStyle w:val="Compact"/>
+            </w:pPr>
+            <w:r>
+              <w:t>Decisão 26</w:t>
+            </w:r>
+          </w:p>
+        </w:tc>
+        <w:tc>
+          <w:tcPr>
+            <w:tcW w:w="0" w:type="auto"/>
+          </w:tcPr>
+          <w:p>
+            <w:pPr>
+              <w:pStyle w:val="Compact"/>
+            </w:pPr>
+            <w:r>
+              <w:t>Pode falhar no primeiro uso real</w:t>
+            </w:r>
+          </w:p>
+        </w:tc>
+        <w:tc>
+          <w:tcPr>
+            <w:tcW w:w="0" w:type="auto"/>
+          </w:tcPr>
+          <w:p>
+            <w:pPr>
+              <w:pStyle w:val="Compact"/>
+            </w:pPr>
+            <w:r>
+              <w:t>Primeiro teste do §0</w:t>
             </w:r>
           </w:p>
         </w:tc>
@@ -4628,6 +5291,60 @@
             </w:pPr>
             <w:r>
               <w:t>6 meses (18/02/2027)</w:t>
+            </w:r>
+          </w:p>
+        </w:tc>
+      </w:tr>
+      <w:tr>
+        <w:tc>
+          <w:tcPr>
+            <w:tcW w:w="0" w:type="auto"/>
+          </w:tcPr>
+          <w:p>
+            <w:pPr>
+              <w:pStyle w:val="Compact"/>
+            </w:pPr>
+            <w:r>
+              <w:t>vtae executar não detecta prova não exclusiva: esperar por algo que já estava na tela antes da ação passa mesmo se a ação falhar</w:t>
+            </w:r>
+          </w:p>
+        </w:tc>
+        <w:tc>
+          <w:tcPr>
+            <w:tcW w:w="0" w:type="auto"/>
+          </w:tcPr>
+          <w:p>
+            <w:pPr>
+              <w:pStyle w:val="Compact"/>
+            </w:pPr>
+            <w:r>
+              <w:t>Uso real 23/10 (login APEX)</w:t>
+            </w:r>
+          </w:p>
+        </w:tc>
+        <w:tc>
+          <w:tcPr>
+            <w:tcW w:w="0" w:type="auto"/>
+          </w:tcPr>
+          <w:p>
+            <w:pPr>
+              <w:pStyle w:val="Compact"/>
+            </w:pPr>
+            <w:r>
+              <w:t>Prova falsa: passo verde sem provar nada</w:t>
+            </w:r>
+          </w:p>
+        </w:tc>
+        <w:tc>
+          <w:tcPr>
+            <w:tcW w:w="0" w:type="auto"/>
+          </w:tcPr>
+          <w:p>
+            <w:pPr>
+              <w:pStyle w:val="Compact"/>
+            </w:pPr>
+            <w:r>
+              <w:t>Teste de cadastro</w:t>
             </w:r>
           </w:p>
         </w:tc>
@@ -4644,13 +5361,13 @@
       <w:pPr>
         <w:pStyle w:val="Ttulo2"/>
       </w:pPr>
-      <w:bookmarkStart w:id="33" w:name="impedimentos"/>
-      <w:bookmarkStart w:id="34" w:name="_Toc241137405"/>
-      <w:bookmarkEnd w:id="31"/>
+      <w:bookmarkStart w:id="33" w:name="_Toc241137405"/>
+      <w:bookmarkStart w:id="34" w:name="impedimentos"/>
+      <w:bookmarkEnd w:id="32"/>
       <w:r>
         <w:t>Impedimentos</w:t>
       </w:r>
-      <w:bookmarkEnd w:id="34"/>
+      <w:bookmarkEnd w:id="33"/>
     </w:p>
     <w:p>
       <w:pPr>
@@ -4675,13 +5392,14 @@
       <w:pPr>
         <w:pStyle w:val="Ttulo2"/>
       </w:pPr>
-      <w:bookmarkStart w:id="35" w:name="anexo-a-legado-arquivado"/>
-      <w:bookmarkStart w:id="36" w:name="_Toc241137406"/>
-      <w:bookmarkEnd w:id="33"/>
-      <w:r>
+      <w:bookmarkStart w:id="35" w:name="_Toc241137406"/>
+      <w:bookmarkStart w:id="36" w:name="anexo-a-legado-arquivado"/>
+      <w:bookmarkEnd w:id="34"/>
+      <w:r>
+        <w:lastRenderedPageBreak/>
         <w:t>Anexo A — Legado arquivado</w:t>
       </w:r>
-      <w:bookmarkEnd w:id="36"/>
+      <w:bookmarkEnd w:id="35"/>
     </w:p>
     <w:p>
       <w:pPr>
@@ -4704,7 +5422,6 @@
       </w:pPr>
       <w:bookmarkStart w:id="37" w:name="Xd0df3eb3e02050165ba98ac7f968c01e750a5b9"/>
       <w:r>
-        <w:lastRenderedPageBreak/>
         <w:t>A.1 Testes que viraram referência histórica</w:t>
       </w:r>
     </w:p>
@@ -4915,14 +5632,14 @@
       <w:pPr>
         <w:pStyle w:val="Ttulo2"/>
       </w:pPr>
-      <w:bookmarkStart w:id="42" w:name="histórico-de-sessões"/>
-      <w:bookmarkStart w:id="43" w:name="_Toc241137407"/>
-      <w:bookmarkEnd w:id="35"/>
+      <w:bookmarkStart w:id="42" w:name="_Toc241137407"/>
+      <w:bookmarkStart w:id="43" w:name="histórico-de-sessões"/>
+      <w:bookmarkEnd w:id="36"/>
       <w:bookmarkEnd w:id="41"/>
       <w:r>
         <w:t>Histórico de sessões</w:t>
       </w:r>
-      <w:bookmarkEnd w:id="43"/>
+      <w:bookmarkEnd w:id="42"/>
     </w:p>
     <w:tbl>
       <w:tblPr>
@@ -4976,6 +5693,7 @@
               <w:pStyle w:val="Compact"/>
             </w:pPr>
             <w:r>
+              <w:lastRenderedPageBreak/>
               <w:t>12/08/2026</w:t>
             </w:r>
           </w:p>
@@ -4989,9 +5707,7 @@
               <w:pStyle w:val="Compact"/>
             </w:pPr>
             <w:r>
-              <w:t xml:space="preserve">Revisão de direção. Framework declarado independente de sistema; testes atuais viraram referência histórica; gate duplo instituído; fases renumeradas 1–6; documentos reduzidos a quatro, sem versão no </w:t>
-              <w:lastRenderedPageBreak/>
-              <w:t>nome; acoplamento a Oracle Forms no núcleo descoberto por leitura de código; confirmado que o motor declarativo já existe e funciona. Nenhum código alterado.</w:t>
+              <w:t>Revisão de direção. Framework declarado independente de sistema; testes atuais viraram referência histórica; gate duplo instituído; fases renumeradas 1–6; documentos reduzidos a quatro, sem versão no nome; acoplamento a Oracle Forms no núcleo descoberto por leitura de código; confirmado que o motor declarativo já existe e funciona. Nenhum código alterado.</w:t>
             </w:r>
           </w:p>
         </w:tc>
@@ -5006,7 +5722,6 @@
               <w:pStyle w:val="Compact"/>
             </w:pPr>
             <w:r>
-              <w:lastRenderedPageBreak/>
               <w:t>18/08/2026</w:t>
             </w:r>
           </w:p>
@@ -5121,20 +5836,57 @@
               <w:pStyle w:val="Compact"/>
             </w:pPr>
             <w:r>
-              <w:t xml:space="preserve">25/09/2026</w:t>
-            </w:r>
-          </w:p>
-        </w:tc>
-        <w:tc>
-          <w:tcPr>
-            <w:tcW w:w="0" w:type="auto"/>
-          </w:tcPr>
-          <w:p>
-            <w:pPr>
-              <w:pStyle w:val="Compact"/>
-            </w:pPr>
-            <w:r>
-              <w:t xml:space="preserve">Primeiro teste criado por Helio sem ajuda, num sistema real (login do SI3, pasta si3_testes), seguindo o §0 do Manual de Criação: mapeou com vtae mapear, escreveu o roteiro e fechou o gate com vtae executar --vezes 3 (3/3). O uso real revelou e corrigiu: falta do hífen nos passos engolia passos em silêncio (agora erro claro); erro de escrita gerava relatório "PASSOU 0/0" (removido); vtae mapear pegava o título da janela errada e aceitava retângulo da tela inteira (corrigidos); região de leitura com o rótulo junto; prova que não era exclusiva da tela depois da ação. Manual de Criação v3.1 com essas lições. Pendência do btn_sair resolvida no mesmo dia: o template no objects/ apontava para btn_conectar.png (o recorte certo já existia). Gate refeito às 12:29 — 3/3, btn_sair por template (≈1,2 s por clique, antes ≈5 s). Revelado: o aviso de degradação só ia para o terminal (print em acoes.py), fora do execution.log, do JSON e do relatório — o gate das 11:45 passou degradado sem registro. Teste de login fechado. Corrigida a degradação invisível: o aviso agora vai para o execution.log e o execution.json, e o gate recusa fechar com degradação. Provado nos dois sentidos às 13:20–13:23 — template trocado de propósito: GATE NAO FECHADO na execução 1; template certo: GATE FECHADO 3/3. 952 testes unitários passando (corrigido também o os.chdir que vazava entre testes do vtae executar). Manual de Criação v3.2. Início do segundo teste (cadastro): Helio não sabia onde pôr os objetos — o vtae mapear com o exemplo meu_sistema criou uma pasta separada do sistema, e o manual não dizia que os elementos do caminho até a tela (menu, busca, popup) vão no arquivo de objetos do roteiro. Manual de Criação v3.3: uma pasta por sistema, um arquivo por funcionalidade; §0.9 ganhou “Chegar até a tela”. Primeira evidência real para a herança de elementos comuns (3.1): tela_principal repetido entre login e cadastro. Ao copiar os blocos do login, o arquivo ficou sem tela:/objetos: e com recuo misto, e o vtae mapear quebrou com traceback do yaml. Corrigido: arquivo de objetos mal escrito agora para com a linha e o formato certo, tanto no vtae mapear quanto no vtae executar; §0.9 diz para onde copiar. Passo a passo do cadastro mínimo (PDF de Helio) mostrou o duplo clique no item do menu: clicar_duas_vezes virou o nono verbo do roteiro (Manual de Criação v3.4, §3.1), com 2 testes novos.</w:t>
+              <w:t>25/09/2026</w:t>
+            </w:r>
+          </w:p>
+        </w:tc>
+        <w:tc>
+          <w:tcPr>
+            <w:tcW w:w="0" w:type="auto"/>
+          </w:tcPr>
+          <w:p>
+            <w:pPr>
+              <w:pStyle w:val="Compact"/>
+            </w:pPr>
+            <w:r>
+              <w:t xml:space="preserve">Primeiro teste criado por Helio sem ajuda, num sistema real (login do SI3, pasta si3_testes), seguindo o §0 do Manual de Criação: mapeou com vtae mapear, escreveu o roteiro e fechou o gate com vtae executar --vezes 3 (3/3). O uso real revelou e corrigiu: falta do hífen nos passos engolia passos em silêncio (agora erro claro); erro de escrita gerava </w:t>
+            </w:r>
+            <w:r>
+              <w:lastRenderedPageBreak/>
+              <w:t>relatório "PASSOU 0/0" (removido); vtae mapear pegava o título da janela errada e aceitava retângulo da tela inteira (corrigidos); região de leitura com o rótulo junto; prova que não era exclusiva da tela depois da ação. Manual de Criação v3.1 com essas lições. Pendência do btn_sair resolvida no mesmo dia: o template no objects/ apontava para btn_conectar.png (o recorte certo já existia). Gate refeito às 12:29 — 3/3, btn_sair por template (≈1,2 s por clique, antes ≈5 s). Revelado: o aviso de degradação só ia para o terminal (print em acoes.py), fora do execution.log, do JSON e do relatório — o gate das 11:45 passou degradado sem registro. Teste de login fechado. Corrigida a degradação invisível: o aviso agora vai para o execution.log e o execution.json, e o gate recusa fechar com degradação. Provado nos dois sentidos às 13:20–13:23 — template trocado de propósito: GATE NAO FECHADO na execução 1; template certo: GATE FECHADO 3/3. 952 testes unitários passando (corrigido também o os.chdir que vazava entre testes do vtae executar). Manual de Criação v3.2. Início do segundo teste (cadastro): Helio não sabia onde pôr os objetos — o vtae mapear com o exemplo meu_sistema criou uma pasta separada do sistema, e o manual não dizia que os elementos do caminho até a tela (menu, busca, popup) vão no arquivo de objetos do roteiro. Manual de Criação v3.3: uma pasta por sistema, um arquivo por funcionalidade; §0.9 ganhou “Chegar até a tela”. Primeira evidência real para a herança de elementos comuns (3.1): tela_principal repetido entre login e cadastro. Ao copiar os blocos do login, o arquivo ficou sem tela:/objetos: e com recuo misto, e o vtae mapear quebrou com traceback do yaml. Corrigido: arquivo de objetos mal escrito agora para com a linha e o formato certo, tanto no vtae mapear quanto no vtae executar; §0.9 diz para onde copiar. Passo a passo do cadastro mínimo (PDF de Helio) mostrou o duplo clique no item do menu: clicar_duas_vezes virou o nono verbo do roteiro (Manual de Criação v3.4, §3.1), com 2 testes novos.</w:t>
+            </w:r>
+          </w:p>
+        </w:tc>
+      </w:tr>
+      <w:tr>
+        <w:tc>
+          <w:tcPr>
+            <w:tcW w:w="0" w:type="auto"/>
+          </w:tcPr>
+          <w:p>
+            <w:pPr>
+              <w:pStyle w:val="Compact"/>
+            </w:pPr>
+            <w:r>
+              <w:lastRenderedPageBreak/>
+              <w:t>23/10/2026</w:t>
+            </w:r>
+          </w:p>
+        </w:tc>
+        <w:tc>
+          <w:tcPr>
+            <w:tcW w:w="0" w:type="auto"/>
+          </w:tcPr>
+          <w:p>
+            <w:pPr>
+              <w:pStyle w:val="Compact"/>
+            </w:pPr>
+            <w:r>
+              <w:t xml:space="preserve">Pasta raiz do projeto renomeada: pip install -e . e o .venv guardavam o caminho antigo — vtae dava "No module named 'vtae'" e pip dava "Fatal error in launcher". Corrigido reinstalando o pacote e recriando o .venv com python -m pip; registrado no README, seção Problemas comuns. README reescrito genérico — sem nomes de sistemas, só &lt;sistema&gt;/&lt;funcionalidade&gt;. Testes antigos apagados de propósito por Helio para refazer tudo do zero no formato novo, inclusive o piloto CadastroMin: bancada desktop passa a "a definir"; test_piloto_cadastro_min.py ficou obsoleto (954 passando, 2 falhas por arquivos apagados) e sai. Login do sistema de prova migrou para APEX (via área de trabalho remota): Helio remapeou com vtae mapear e escreveu o roteiro sozinho. Medição dos recortes contra as evidências mostrou um passo sem valor de prova: esperar login logo após clicar </w:t>
+            </w:r>
+            <w:r>
+              <w:lastRenderedPageBreak/>
+              <w:t>login (recorte já presente antes do clique, score 1.00). Passo removido; a prova do login é foco_tela_principal (0.34 na tela de login, 1.00 na principal). Gate 3/3 fechado. Nova dívida: vtae executar não detecta prova não exclusiva. OCR segue aceitando HELIO.PAULIED (dívida já registrada).</w:t>
             </w:r>
           </w:p>
         </w:tc>
@@ -5142,6 +5894,7 @@
     </w:tbl>
     <w:p>
       <w:r>
+        <w:lastRenderedPageBreak/>
         <w:pict>
           <v:rect id="_x0000_i1042" style="width:0;height:1.5pt" o:hralign="center" o:hrstd="t" o:hr="t"/>
         </w:pict>
@@ -5156,10 +5909,10 @@
           <w:i/>
           <w:iCs/>
         </w:rPr>
-        <w:t>VTAE · Roadmap · v2 · 25/09/2026</w:t>
-      </w:r>
-      <w:bookmarkEnd w:id="0"/>
-      <w:bookmarkEnd w:id="42"/>
+        <w:t>VTAE · Roadmap · v2 · 23/10/2026</w:t>
+      </w:r>
+      <w:bookmarkEnd w:id="2"/>
+      <w:bookmarkEnd w:id="43"/>
     </w:p>
     <w:sectPr>
       <w:pgSz w:w="12240" w:h="15840"/>
@@ -6222,160 +6975,200 @@
   <w:docDefaults>
     <w:rPrDefault>
       <w:rPr>
-        <w:rFonts w:asciiTheme="minorHAnsi" w:eastAsiaTheme="minorEastAsia" w:hAnsiTheme="minorHAnsi" w:cstheme="minorBidi"/>
-        <w:sz w:val="22"/>
-        <w:szCs w:val="22"/>
-        <w:lang w:val="pt-BR" w:eastAsia="pt-BR" w:bidi="ar-SA"/>
+        <w:rFonts w:asciiTheme="minorHAnsi" w:eastAsiaTheme="minorHAnsi" w:hAnsiTheme="minorHAnsi" w:cstheme="minorBidi"/>
+        <w:sz w:val="24"/>
+        <w:szCs w:val="24"/>
+        <w:lang w:val="en-US" w:eastAsia="en-US" w:bidi="ar-SA"/>
       </w:rPr>
     </w:rPrDefault>
     <w:pPrDefault>
       <w:pPr>
-        <w:spacing w:after="200" w:line="276" w:lineRule="auto"/>
+        <w:spacing w:after="200"/>
       </w:pPr>
     </w:pPrDefault>
   </w:docDefaults>
-  <w:latentStyles w:defLockedState="0" w:defUIPriority="99" w:defSemiHidden="1" w:defUnhideWhenUsed="1" w:defQFormat="0" w:count="267">
-    <w:lsdException w:name="Normal" w:semiHidden="0" w:uiPriority="0" w:unhideWhenUsed="0" w:qFormat="1"/>
-    <w:lsdException w:name="heading 1" w:semiHidden="0" w:uiPriority="9" w:unhideWhenUsed="0" w:qFormat="1"/>
-    <w:lsdException w:name="heading 2" w:uiPriority="9" w:qFormat="1"/>
-    <w:lsdException w:name="heading 3" w:uiPriority="9" w:qFormat="1"/>
-    <w:lsdException w:name="heading 4" w:uiPriority="9" w:qFormat="1"/>
-    <w:lsdException w:name="heading 5" w:uiPriority="9" w:qFormat="1"/>
-    <w:lsdException w:name="heading 6" w:uiPriority="9" w:qFormat="1"/>
-    <w:lsdException w:name="heading 7" w:uiPriority="9" w:qFormat="1"/>
-    <w:lsdException w:name="heading 8" w:uiPriority="9" w:qFormat="1"/>
-    <w:lsdException w:name="heading 9" w:uiPriority="9" w:qFormat="1"/>
+  <w:latentStyles w:defLockedState="0" w:defUIPriority="0" w:defSemiHidden="0" w:defUnhideWhenUsed="0" w:defQFormat="0" w:count="267">
     <w:lsdException w:name="toc 1" w:uiPriority="39"/>
     <w:lsdException w:name="toc 2" w:uiPriority="39"/>
-    <w:lsdException w:name="toc 3" w:uiPriority="39"/>
-    <w:lsdException w:name="toc 4" w:uiPriority="39"/>
-    <w:lsdException w:name="toc 5" w:uiPriority="39"/>
-    <w:lsdException w:name="toc 6" w:uiPriority="39"/>
-    <w:lsdException w:name="toc 7" w:uiPriority="39"/>
-    <w:lsdException w:name="toc 8" w:uiPriority="39"/>
-    <w:lsdException w:name="toc 9" w:uiPriority="39"/>
-    <w:lsdException w:name="caption" w:uiPriority="35" w:qFormat="1"/>
-    <w:lsdException w:name="Title" w:semiHidden="0" w:uiPriority="10" w:unhideWhenUsed="0" w:qFormat="1"/>
-    <w:lsdException w:name="Default Paragraph Font" w:uiPriority="1"/>
-    <w:lsdException w:name="Subtitle" w:semiHidden="0" w:uiPriority="11" w:unhideWhenUsed="0" w:qFormat="1"/>
-    <w:lsdException w:name="Strong" w:semiHidden="0" w:uiPriority="22" w:unhideWhenUsed="0" w:qFormat="1"/>
-    <w:lsdException w:name="Emphasis" w:semiHidden="0" w:uiPriority="20" w:unhideWhenUsed="0" w:qFormat="1"/>
-    <w:lsdException w:name="Table Grid" w:semiHidden="0" w:uiPriority="59" w:unhideWhenUsed="0"/>
-    <w:lsdException w:name="Placeholder Text" w:unhideWhenUsed="0"/>
-    <w:lsdException w:name="No Spacing" w:semiHidden="0" w:uiPriority="1" w:unhideWhenUsed="0" w:qFormat="1"/>
-    <w:lsdException w:name="Light Shading" w:semiHidden="0" w:uiPriority="60" w:unhideWhenUsed="0"/>
-    <w:lsdException w:name="Light List" w:semiHidden="0" w:uiPriority="61" w:unhideWhenUsed="0"/>
-    <w:lsdException w:name="Light Grid" w:semiHidden="0" w:uiPriority="62" w:unhideWhenUsed="0"/>
-    <w:lsdException w:name="Medium Shading 1" w:semiHidden="0" w:uiPriority="63" w:unhideWhenUsed="0"/>
-    <w:lsdException w:name="Medium Shading 2" w:semiHidden="0" w:uiPriority="64" w:unhideWhenUsed="0"/>
-    <w:lsdException w:name="Medium List 1" w:semiHidden="0" w:uiPriority="65" w:unhideWhenUsed="0"/>
-    <w:lsdException w:name="Medium List 2" w:semiHidden="0" w:uiPriority="66" w:unhideWhenUsed="0"/>
-    <w:lsdException w:name="Medium Grid 1" w:semiHidden="0" w:uiPriority="67" w:unhideWhenUsed="0"/>
-    <w:lsdException w:name="Medium Grid 2" w:semiHidden="0" w:uiPriority="68" w:unhideWhenUsed="0"/>
-    <w:lsdException w:name="Medium Grid 3" w:semiHidden="0" w:uiPriority="69" w:unhideWhenUsed="0"/>
-    <w:lsdException w:name="Dark List" w:semiHidden="0" w:uiPriority="70" w:unhideWhenUsed="0"/>
-    <w:lsdException w:name="Colorful Shading" w:semiHidden="0" w:uiPriority="71" w:unhideWhenUsed="0"/>
-    <w:lsdException w:name="Colorful List" w:semiHidden="0" w:uiPriority="72" w:unhideWhenUsed="0"/>
-    <w:lsdException w:name="Colorful Grid" w:semiHidden="0" w:uiPriority="73" w:unhideWhenUsed="0"/>
-    <w:lsdException w:name="Light Shading Accent 1" w:semiHidden="0" w:uiPriority="60" w:unhideWhenUsed="0"/>
-    <w:lsdException w:name="Light List Accent 1" w:semiHidden="0" w:uiPriority="61" w:unhideWhenUsed="0"/>
-    <w:lsdException w:name="Light Grid Accent 1" w:semiHidden="0" w:uiPriority="62" w:unhideWhenUsed="0"/>
-    <w:lsdException w:name="Medium Shading 1 Accent 1" w:semiHidden="0" w:uiPriority="63" w:unhideWhenUsed="0"/>
-    <w:lsdException w:name="Medium Shading 2 Accent 1" w:semiHidden="0" w:uiPriority="64" w:unhideWhenUsed="0"/>
-    <w:lsdException w:name="Medium List 1 Accent 1" w:semiHidden="0" w:uiPriority="65" w:unhideWhenUsed="0"/>
-    <w:lsdException w:name="Revision" w:unhideWhenUsed="0"/>
-    <w:lsdException w:name="List Paragraph" w:semiHidden="0" w:uiPriority="34" w:unhideWhenUsed="0" w:qFormat="1"/>
-    <w:lsdException w:name="Quote" w:semiHidden="0" w:uiPriority="29" w:unhideWhenUsed="0" w:qFormat="1"/>
-    <w:lsdException w:name="Intense Quote" w:semiHidden="0" w:uiPriority="30" w:unhideWhenUsed="0" w:qFormat="1"/>
-    <w:lsdException w:name="Medium List 2 Accent 1" w:semiHidden="0" w:uiPriority="66" w:unhideWhenUsed="0"/>
-    <w:lsdException w:name="Medium Grid 1 Accent 1" w:semiHidden="0" w:uiPriority="67" w:unhideWhenUsed="0"/>
-    <w:lsdException w:name="Medium Grid 2 Accent 1" w:semiHidden="0" w:uiPriority="68" w:unhideWhenUsed="0"/>
-    <w:lsdException w:name="Medium Grid 3 Accent 1" w:semiHidden="0" w:uiPriority="69" w:unhideWhenUsed="0"/>
-    <w:lsdException w:name="Dark List Accent 1" w:semiHidden="0" w:uiPriority="70" w:unhideWhenUsed="0"/>
-    <w:lsdException w:name="Colorful Shading Accent 1" w:semiHidden="0" w:uiPriority="71" w:unhideWhenUsed="0"/>
-    <w:lsdException w:name="Colorful List Accent 1" w:semiHidden="0" w:uiPriority="72" w:unhideWhenUsed="0"/>
-    <w:lsdException w:name="Colorful Grid Accent 1" w:semiHidden="0" w:uiPriority="73" w:unhideWhenUsed="0"/>
-    <w:lsdException w:name="Light Shading Accent 2" w:semiHidden="0" w:uiPriority="60" w:unhideWhenUsed="0"/>
-    <w:lsdException w:name="Light List Accent 2" w:semiHidden="0" w:uiPriority="61" w:unhideWhenUsed="0"/>
-    <w:lsdException w:name="Light Grid Accent 2" w:semiHidden="0" w:uiPriority="62" w:unhideWhenUsed="0"/>
-    <w:lsdException w:name="Medium Shading 1 Accent 2" w:semiHidden="0" w:uiPriority="63" w:unhideWhenUsed="0"/>
-    <w:lsdException w:name="Medium Shading 2 Accent 2" w:semiHidden="0" w:uiPriority="64" w:unhideWhenUsed="0"/>
-    <w:lsdException w:name="Medium List 1 Accent 2" w:semiHidden="0" w:uiPriority="65" w:unhideWhenUsed="0"/>
-    <w:lsdException w:name="Medium List 2 Accent 2" w:semiHidden="0" w:uiPriority="66" w:unhideWhenUsed="0"/>
-    <w:lsdException w:name="Medium Grid 1 Accent 2" w:semiHidden="0" w:uiPriority="67" w:unhideWhenUsed="0"/>
-    <w:lsdException w:name="Medium Grid 2 Accent 2" w:semiHidden="0" w:uiPriority="68" w:unhideWhenUsed="0"/>
-    <w:lsdException w:name="Medium Grid 3 Accent 2" w:semiHidden="0" w:uiPriority="69" w:unhideWhenUsed="0"/>
-    <w:lsdException w:name="Dark List Accent 2" w:semiHidden="0" w:uiPriority="70" w:unhideWhenUsed="0"/>
-    <w:lsdException w:name="Colorful Shading Accent 2" w:semiHidden="0" w:uiPriority="71" w:unhideWhenUsed="0"/>
-    <w:lsdException w:name="Colorful List Accent 2" w:semiHidden="0" w:uiPriority="72" w:unhideWhenUsed="0"/>
-    <w:lsdException w:name="Colorful Grid Accent 2" w:semiHidden="0" w:uiPriority="73" w:unhideWhenUsed="0"/>
-    <w:lsdException w:name="Light Shading Accent 3" w:semiHidden="0" w:uiPriority="60" w:unhideWhenUsed="0"/>
-    <w:lsdException w:name="Light List Accent 3" w:semiHidden="0" w:uiPriority="61" w:unhideWhenUsed="0"/>
-    <w:lsdException w:name="Light Grid Accent 3" w:semiHidden="0" w:uiPriority="62" w:unhideWhenUsed="0"/>
-    <w:lsdException w:name="Medium Shading 1 Accent 3" w:semiHidden="0" w:uiPriority="63" w:unhideWhenUsed="0"/>
-    <w:lsdException w:name="Medium Shading 2 Accent 3" w:semiHidden="0" w:uiPriority="64" w:unhideWhenUsed="0"/>
-    <w:lsdException w:name="Medium List 1 Accent 3" w:semiHidden="0" w:uiPriority="65" w:unhideWhenUsed="0"/>
-    <w:lsdException w:name="Medium List 2 Accent 3" w:semiHidden="0" w:uiPriority="66" w:unhideWhenUsed="0"/>
-    <w:lsdException w:name="Medium Grid 1 Accent 3" w:semiHidden="0" w:uiPriority="67" w:unhideWhenUsed="0"/>
-    <w:lsdException w:name="Medium Grid 2 Accent 3" w:semiHidden="0" w:uiPriority="68" w:unhideWhenUsed="0"/>
-    <w:lsdException w:name="Medium Grid 3 Accent 3" w:semiHidden="0" w:uiPriority="69" w:unhideWhenUsed="0"/>
-    <w:lsdException w:name="Dark List Accent 3" w:semiHidden="0" w:uiPriority="70" w:unhideWhenUsed="0"/>
-    <w:lsdException w:name="Colorful Shading Accent 3" w:semiHidden="0" w:uiPriority="71" w:unhideWhenUsed="0"/>
-    <w:lsdException w:name="Colorful List Accent 3" w:semiHidden="0" w:uiPriority="72" w:unhideWhenUsed="0"/>
-    <w:lsdException w:name="Colorful Grid Accent 3" w:semiHidden="0" w:uiPriority="73" w:unhideWhenUsed="0"/>
-    <w:lsdException w:name="Light Shading Accent 4" w:semiHidden="0" w:uiPriority="60" w:unhideWhenUsed="0"/>
-    <w:lsdException w:name="Light List Accent 4" w:semiHidden="0" w:uiPriority="61" w:unhideWhenUsed="0"/>
-    <w:lsdException w:name="Light Grid Accent 4" w:semiHidden="0" w:uiPriority="62" w:unhideWhenUsed="0"/>
-    <w:lsdException w:name="Medium Shading 1 Accent 4" w:semiHidden="0" w:uiPriority="63" w:unhideWhenUsed="0"/>
-    <w:lsdException w:name="Medium Shading 2 Accent 4" w:semiHidden="0" w:uiPriority="64" w:unhideWhenUsed="0"/>
-    <w:lsdException w:name="Medium List 1 Accent 4" w:semiHidden="0" w:uiPriority="65" w:unhideWhenUsed="0"/>
-    <w:lsdException w:name="Medium List 2 Accent 4" w:semiHidden="0" w:uiPriority="66" w:unhideWhenUsed="0"/>
-    <w:lsdException w:name="Medium Grid 1 Accent 4" w:semiHidden="0" w:uiPriority="67" w:unhideWhenUsed="0"/>
-    <w:lsdException w:name="Medium Grid 2 Accent 4" w:semiHidden="0" w:uiPriority="68" w:unhideWhenUsed="0"/>
-    <w:lsdException w:name="Medium Grid 3 Accent 4" w:semiHidden="0" w:uiPriority="69" w:unhideWhenUsed="0"/>
-    <w:lsdException w:name="Dark List Accent 4" w:semiHidden="0" w:uiPriority="70" w:unhideWhenUsed="0"/>
-    <w:lsdException w:name="Colorful Shading Accent 4" w:semiHidden="0" w:uiPriority="71" w:unhideWhenUsed="0"/>
-    <w:lsdException w:name="Colorful List Accent 4" w:semiHidden="0" w:uiPriority="72" w:unhideWhenUsed="0"/>
-    <w:lsdException w:name="Colorful Grid Accent 4" w:semiHidden="0" w:uiPriority="73" w:unhideWhenUsed="0"/>
-    <w:lsdException w:name="Light Shading Accent 5" w:semiHidden="0" w:uiPriority="60" w:unhideWhenUsed="0"/>
-    <w:lsdException w:name="Light List Accent 5" w:semiHidden="0" w:uiPriority="61" w:unhideWhenUsed="0"/>
-    <w:lsdException w:name="Light Grid Accent 5" w:semiHidden="0" w:uiPriority="62" w:unhideWhenUsed="0"/>
-    <w:lsdException w:name="Medium Shading 1 Accent 5" w:semiHidden="0" w:uiPriority="63" w:unhideWhenUsed="0"/>
-    <w:lsdException w:name="Medium Shading 2 Accent 5" w:semiHidden="0" w:uiPriority="64" w:unhideWhenUsed="0"/>
-    <w:lsdException w:name="Medium List 1 Accent 5" w:semiHidden="0" w:uiPriority="65" w:unhideWhenUsed="0"/>
-    <w:lsdException w:name="Medium List 2 Accent 5" w:semiHidden="0" w:uiPriority="66" w:unhideWhenUsed="0"/>
-    <w:lsdException w:name="Medium Grid 1 Accent 5" w:semiHidden="0" w:uiPriority="67" w:unhideWhenUsed="0"/>
-    <w:lsdException w:name="Medium Grid 2 Accent 5" w:semiHidden="0" w:uiPriority="68" w:unhideWhenUsed="0"/>
-    <w:lsdException w:name="Medium Grid 3 Accent 5" w:semiHidden="0" w:uiPriority="69" w:unhideWhenUsed="0"/>
-    <w:lsdException w:name="Dark List Accent 5" w:semiHidden="0" w:uiPriority="70" w:unhideWhenUsed="0"/>
-    <w:lsdException w:name="Colorful Shading Accent 5" w:semiHidden="0" w:uiPriority="71" w:unhideWhenUsed="0"/>
-    <w:lsdException w:name="Colorful List Accent 5" w:semiHidden="0" w:uiPriority="72" w:unhideWhenUsed="0"/>
-    <w:lsdException w:name="Colorful Grid Accent 5" w:semiHidden="0" w:uiPriority="73" w:unhideWhenUsed="0"/>
-    <w:lsdException w:name="Light Shading Accent 6" w:semiHidden="0" w:uiPriority="60" w:unhideWhenUsed="0"/>
-    <w:lsdException w:name="Light List Accent 6" w:semiHidden="0" w:uiPriority="61" w:unhideWhenUsed="0"/>
-    <w:lsdException w:name="Light Grid Accent 6" w:semiHidden="0" w:uiPriority="62" w:unhideWhenUsed="0"/>
-    <w:lsdException w:name="Medium Shading 1 Accent 6" w:semiHidden="0" w:uiPriority="63" w:unhideWhenUsed="0"/>
-    <w:lsdException w:name="Medium Shading 2 Accent 6" w:semiHidden="0" w:uiPriority="64" w:unhideWhenUsed="0"/>
-    <w:lsdException w:name="Medium List 1 Accent 6" w:semiHidden="0" w:uiPriority="65" w:unhideWhenUsed="0"/>
-    <w:lsdException w:name="Medium List 2 Accent 6" w:semiHidden="0" w:uiPriority="66" w:unhideWhenUsed="0"/>
-    <w:lsdException w:name="Medium Grid 1 Accent 6" w:semiHidden="0" w:uiPriority="67" w:unhideWhenUsed="0"/>
-    <w:lsdException w:name="Medium Grid 2 Accent 6" w:semiHidden="0" w:uiPriority="68" w:unhideWhenUsed="0"/>
-    <w:lsdException w:name="Medium Grid 3 Accent 6" w:semiHidden="0" w:uiPriority="69" w:unhideWhenUsed="0"/>
-    <w:lsdException w:name="Dark List Accent 6" w:semiHidden="0" w:uiPriority="70" w:unhideWhenUsed="0"/>
-    <w:lsdException w:name="Colorful Shading Accent 6" w:semiHidden="0" w:uiPriority="71" w:unhideWhenUsed="0"/>
-    <w:lsdException w:name="Colorful List Accent 6" w:semiHidden="0" w:uiPriority="72" w:unhideWhenUsed="0"/>
-    <w:lsdException w:name="Colorful Grid Accent 6" w:semiHidden="0" w:uiPriority="73" w:unhideWhenUsed="0"/>
-    <w:lsdException w:name="Subtle Emphasis" w:semiHidden="0" w:uiPriority="19" w:unhideWhenUsed="0" w:qFormat="1"/>
-    <w:lsdException w:name="Intense Emphasis" w:semiHidden="0" w:uiPriority="21" w:unhideWhenUsed="0" w:qFormat="1"/>
-    <w:lsdException w:name="Subtle Reference" w:semiHidden="0" w:uiPriority="31" w:unhideWhenUsed="0" w:qFormat="1"/>
-    <w:lsdException w:name="Intense Reference" w:semiHidden="0" w:uiPriority="32" w:unhideWhenUsed="0" w:qFormat="1"/>
-    <w:lsdException w:name="Book Title" w:semiHidden="0" w:uiPriority="33" w:unhideWhenUsed="0" w:qFormat="1"/>
-    <w:lsdException w:name="Bibliography" w:uiPriority="37"/>
-    <w:lsdException w:name="TOC Heading" w:uiPriority="39" w:qFormat="1"/>
+    <w:lsdException w:name="Hyperlink" w:uiPriority="99"/>
   </w:latentStyles>
   <w:style w:type="paragraph" w:default="1" w:styleId="Normal">
     <w:name w:val="Normal"/>
     <w:qFormat/>
+  </w:style>
+  <w:style w:type="paragraph" w:styleId="Ttulo1">
+    <w:name w:val="heading 1"/>
+    <w:basedOn w:val="Normal"/>
+    <w:next w:val="Corpodetexto"/>
+    <w:uiPriority w:val="9"/>
+    <w:qFormat/>
+    <w:pPr>
+      <w:keepNext/>
+      <w:keepLines/>
+      <w:spacing w:before="480" w:after="0"/>
+      <w:outlineLvl w:val="0"/>
+    </w:pPr>
+    <w:rPr>
+      <w:rFonts w:asciiTheme="majorHAnsi" w:eastAsiaTheme="majorEastAsia" w:hAnsiTheme="majorHAnsi" w:cstheme="majorBidi"/>
+      <w:b/>
+      <w:bCs/>
+      <w:color w:val="4F81BD" w:themeColor="accent1"/>
+      <w:sz w:val="32"/>
+      <w:szCs w:val="32"/>
+    </w:rPr>
+  </w:style>
+  <w:style w:type="paragraph" w:styleId="Ttulo2">
+    <w:name w:val="heading 2"/>
+    <w:basedOn w:val="Normal"/>
+    <w:next w:val="Corpodetexto"/>
+    <w:uiPriority w:val="9"/>
+    <w:unhideWhenUsed/>
+    <w:qFormat/>
+    <w:pPr>
+      <w:keepNext/>
+      <w:keepLines/>
+      <w:spacing w:before="200" w:after="0"/>
+      <w:outlineLvl w:val="1"/>
+    </w:pPr>
+    <w:rPr>
+      <w:rFonts w:asciiTheme="majorHAnsi" w:eastAsiaTheme="majorEastAsia" w:hAnsiTheme="majorHAnsi" w:cstheme="majorBidi"/>
+      <w:b/>
+      <w:bCs/>
+      <w:color w:val="4F81BD" w:themeColor="accent1"/>
+      <w:sz w:val="28"/>
+      <w:szCs w:val="28"/>
+    </w:rPr>
+  </w:style>
+  <w:style w:type="paragraph" w:styleId="Ttulo3">
+    <w:name w:val="heading 3"/>
+    <w:basedOn w:val="Normal"/>
+    <w:next w:val="Corpodetexto"/>
+    <w:uiPriority w:val="9"/>
+    <w:unhideWhenUsed/>
+    <w:qFormat/>
+    <w:pPr>
+      <w:keepNext/>
+      <w:keepLines/>
+      <w:spacing w:before="200" w:after="0"/>
+      <w:outlineLvl w:val="2"/>
+    </w:pPr>
+    <w:rPr>
+      <w:rFonts w:asciiTheme="majorHAnsi" w:eastAsiaTheme="majorEastAsia" w:hAnsiTheme="majorHAnsi" w:cstheme="majorBidi"/>
+      <w:b/>
+      <w:bCs/>
+      <w:color w:val="4F81BD" w:themeColor="accent1"/>
+    </w:rPr>
+  </w:style>
+  <w:style w:type="paragraph" w:styleId="Ttulo4">
+    <w:name w:val="heading 4"/>
+    <w:basedOn w:val="Normal"/>
+    <w:next w:val="Corpodetexto"/>
+    <w:uiPriority w:val="9"/>
+    <w:unhideWhenUsed/>
+    <w:qFormat/>
+    <w:pPr>
+      <w:keepNext/>
+      <w:keepLines/>
+      <w:spacing w:before="200" w:after="0"/>
+      <w:outlineLvl w:val="3"/>
+    </w:pPr>
+    <w:rPr>
+      <w:rFonts w:asciiTheme="majorHAnsi" w:eastAsiaTheme="majorEastAsia" w:hAnsiTheme="majorHAnsi" w:cstheme="majorBidi"/>
+      <w:bCs/>
+      <w:i/>
+      <w:color w:val="4F81BD" w:themeColor="accent1"/>
+    </w:rPr>
+  </w:style>
+  <w:style w:type="paragraph" w:styleId="Ttulo5">
+    <w:name w:val="heading 5"/>
+    <w:basedOn w:val="Normal"/>
+    <w:next w:val="Corpodetexto"/>
+    <w:uiPriority w:val="9"/>
+    <w:unhideWhenUsed/>
+    <w:qFormat/>
+    <w:pPr>
+      <w:keepNext/>
+      <w:keepLines/>
+      <w:spacing w:before="200" w:after="0"/>
+      <w:outlineLvl w:val="4"/>
+    </w:pPr>
+    <w:rPr>
+      <w:rFonts w:asciiTheme="majorHAnsi" w:eastAsiaTheme="majorEastAsia" w:hAnsiTheme="majorHAnsi" w:cstheme="majorBidi"/>
+      <w:iCs/>
+      <w:color w:val="4F81BD" w:themeColor="accent1"/>
+    </w:rPr>
+  </w:style>
+  <w:style w:type="paragraph" w:styleId="Ttulo6">
+    <w:name w:val="heading 6"/>
+    <w:basedOn w:val="Normal"/>
+    <w:next w:val="Corpodetexto"/>
+    <w:uiPriority w:val="9"/>
+    <w:unhideWhenUsed/>
+    <w:qFormat/>
+    <w:pPr>
+      <w:keepNext/>
+      <w:keepLines/>
+      <w:spacing w:before="200" w:after="0"/>
+      <w:outlineLvl w:val="5"/>
+    </w:pPr>
+    <w:rPr>
+      <w:rFonts w:asciiTheme="majorHAnsi" w:eastAsiaTheme="majorEastAsia" w:hAnsiTheme="majorHAnsi" w:cstheme="majorBidi"/>
+      <w:color w:val="4F81BD" w:themeColor="accent1"/>
+    </w:rPr>
+  </w:style>
+  <w:style w:type="paragraph" w:styleId="Ttulo7">
+    <w:name w:val="heading 7"/>
+    <w:basedOn w:val="Normal"/>
+    <w:next w:val="Corpodetexto"/>
+    <w:uiPriority w:val="9"/>
+    <w:unhideWhenUsed/>
+    <w:qFormat/>
+    <w:pPr>
+      <w:keepNext/>
+      <w:keepLines/>
+      <w:spacing w:before="200" w:after="0"/>
+      <w:outlineLvl w:val="6"/>
+    </w:pPr>
+    <w:rPr>
+      <w:rFonts w:asciiTheme="majorHAnsi" w:eastAsiaTheme="majorEastAsia" w:hAnsiTheme="majorHAnsi" w:cstheme="majorBidi"/>
+      <w:color w:val="4F81BD" w:themeColor="accent1"/>
+    </w:rPr>
+  </w:style>
+  <w:style w:type="paragraph" w:styleId="Ttulo8">
+    <w:name w:val="heading 8"/>
+    <w:basedOn w:val="Normal"/>
+    <w:next w:val="Corpodetexto"/>
+    <w:uiPriority w:val="9"/>
+    <w:unhideWhenUsed/>
+    <w:qFormat/>
+    <w:pPr>
+      <w:keepNext/>
+      <w:keepLines/>
+      <w:spacing w:before="200" w:after="0"/>
+      <w:outlineLvl w:val="7"/>
+    </w:pPr>
+    <w:rPr>
+      <w:rFonts w:asciiTheme="majorHAnsi" w:eastAsiaTheme="majorEastAsia" w:hAnsiTheme="majorHAnsi" w:cstheme="majorBidi"/>
+      <w:color w:val="4F81BD" w:themeColor="accent1"/>
+    </w:rPr>
+  </w:style>
+  <w:style w:type="paragraph" w:styleId="Ttulo9">
+    <w:name w:val="heading 9"/>
+    <w:basedOn w:val="Normal"/>
+    <w:next w:val="Corpodetexto"/>
+    <w:uiPriority w:val="9"/>
+    <w:unhideWhenUsed/>
+    <w:qFormat/>
+    <w:pPr>
+      <w:keepNext/>
+      <w:keepLines/>
+      <w:spacing w:before="200" w:after="0"/>
+      <w:outlineLvl w:val="8"/>
+    </w:pPr>
+    <w:rPr>
+      <w:rFonts w:asciiTheme="majorHAnsi" w:eastAsiaTheme="majorEastAsia" w:hAnsiTheme="majorHAnsi" w:cstheme="majorBidi"/>
+      <w:color w:val="4F81BD" w:themeColor="accent1"/>
+    </w:rPr>
   </w:style>
   <w:style w:type="character" w:default="1" w:styleId="Fontepargpadro">
     <w:name w:val="Default Paragraph Font"/>
@@ -6403,6 +7196,614 @@
     <w:uiPriority w:val="99"/>
     <w:semiHidden/>
     <w:unhideWhenUsed/>
+  </w:style>
+  <w:style w:type="paragraph" w:styleId="Corpodetexto">
+    <w:name w:val="Body Text"/>
+    <w:basedOn w:val="Normal"/>
+    <w:qFormat/>
+    <w:pPr>
+      <w:spacing w:before="180" w:after="180"/>
+    </w:pPr>
+  </w:style>
+  <w:style w:type="paragraph" w:customStyle="1" w:styleId="FirstParagraph">
+    <w:name w:val="First Paragraph"/>
+    <w:basedOn w:val="Corpodetexto"/>
+    <w:next w:val="Corpodetexto"/>
+    <w:qFormat/>
+  </w:style>
+  <w:style w:type="paragraph" w:customStyle="1" w:styleId="Compact">
+    <w:name w:val="Compact"/>
+    <w:basedOn w:val="Corpodetexto"/>
+    <w:qFormat/>
+    <w:pPr>
+      <w:spacing w:before="36" w:after="36"/>
+    </w:pPr>
+  </w:style>
+  <w:style w:type="paragraph" w:styleId="Ttulo">
+    <w:name w:val="Title"/>
+    <w:basedOn w:val="Normal"/>
+    <w:next w:val="Corpodetexto"/>
+    <w:qFormat/>
+    <w:pPr>
+      <w:keepNext/>
+      <w:keepLines/>
+      <w:spacing w:before="480" w:after="240"/>
+      <w:jc w:val="center"/>
+    </w:pPr>
+    <w:rPr>
+      <w:rFonts w:asciiTheme="majorHAnsi" w:eastAsiaTheme="majorEastAsia" w:hAnsiTheme="majorHAnsi" w:cstheme="majorBidi"/>
+      <w:b/>
+      <w:bCs/>
+      <w:color w:val="345A8A" w:themeColor="accent1" w:themeShade="B5"/>
+      <w:sz w:val="36"/>
+      <w:szCs w:val="36"/>
+    </w:rPr>
+  </w:style>
+  <w:style w:type="paragraph" w:styleId="Subttulo">
+    <w:name w:val="Subtitle"/>
+    <w:basedOn w:val="Ttulo"/>
+    <w:next w:val="Corpodetexto"/>
+    <w:qFormat/>
+    <w:pPr>
+      <w:spacing w:before="240"/>
+    </w:pPr>
+    <w:rPr>
+      <w:sz w:val="30"/>
+      <w:szCs w:val="30"/>
+    </w:rPr>
+  </w:style>
+  <w:style w:type="paragraph" w:customStyle="1" w:styleId="Author">
+    <w:name w:val="Author"/>
+    <w:next w:val="Corpodetexto"/>
+    <w:qFormat/>
+    <w:pPr>
+      <w:keepNext/>
+      <w:keepLines/>
+      <w:jc w:val="center"/>
+    </w:pPr>
+  </w:style>
+  <w:style w:type="paragraph" w:styleId="Data">
+    <w:name w:val="Date"/>
+    <w:next w:val="Corpodetexto"/>
+    <w:qFormat/>
+    <w:pPr>
+      <w:keepNext/>
+      <w:keepLines/>
+      <w:jc w:val="center"/>
+    </w:pPr>
+  </w:style>
+  <w:style w:type="paragraph" w:customStyle="1" w:styleId="AbstractTitle">
+    <w:name w:val="Abstract Title"/>
+    <w:basedOn w:val="Normal"/>
+    <w:next w:val="Abstract"/>
+    <w:qFormat/>
+    <w:pPr>
+      <w:keepNext/>
+      <w:keepLines/>
+      <w:spacing w:before="300" w:after="0"/>
+      <w:jc w:val="center"/>
+    </w:pPr>
+    <w:rPr>
+      <w:b/>
+      <w:color w:val="345A8A"/>
+      <w:sz w:val="20"/>
+      <w:szCs w:val="20"/>
+    </w:rPr>
+  </w:style>
+  <w:style w:type="paragraph" w:customStyle="1" w:styleId="Abstract">
+    <w:name w:val="Abstract"/>
+    <w:basedOn w:val="Normal"/>
+    <w:next w:val="Corpodetexto"/>
+    <w:qFormat/>
+    <w:pPr>
+      <w:keepNext/>
+      <w:keepLines/>
+      <w:spacing w:before="100" w:after="300"/>
+    </w:pPr>
+    <w:rPr>
+      <w:sz w:val="20"/>
+      <w:szCs w:val="20"/>
+    </w:rPr>
+  </w:style>
+  <w:style w:type="paragraph" w:styleId="Bibliografia">
+    <w:name w:val="Bibliography"/>
+    <w:basedOn w:val="Normal"/>
+    <w:qFormat/>
+  </w:style>
+  <w:style w:type="paragraph" w:styleId="Textoembloco">
+    <w:name w:val="Block Text"/>
+    <w:basedOn w:val="Corpodetexto"/>
+    <w:next w:val="Corpodetexto"/>
+    <w:uiPriority w:val="9"/>
+    <w:unhideWhenUsed/>
+    <w:qFormat/>
+    <w:pPr>
+      <w:spacing w:before="100" w:after="100"/>
+      <w:ind w:left="480" w:right="480"/>
+    </w:pPr>
+  </w:style>
+  <w:style w:type="paragraph" w:styleId="Textodenotaderodap">
+    <w:name w:val="footnote text"/>
+    <w:basedOn w:val="Normal"/>
+    <w:uiPriority w:val="9"/>
+    <w:unhideWhenUsed/>
+    <w:qFormat/>
+  </w:style>
+  <w:style w:type="table" w:customStyle="1" w:styleId="Table">
+    <w:name w:val="Table"/>
+    <w:semiHidden/>
+    <w:unhideWhenUsed/>
+    <w:qFormat/>
+    <w:tblPr>
+      <w:tblInd w:w="0" w:type="dxa"/>
+      <w:tblCellMar>
+        <w:top w:w="0" w:type="dxa"/>
+        <w:left w:w="108" w:type="dxa"/>
+        <w:bottom w:w="0" w:type="dxa"/>
+        <w:right w:w="108" w:type="dxa"/>
+      </w:tblCellMar>
+    </w:tblPr>
+    <w:tblStylePr w:type="firstRow">
+      <w:tblPr>
+        <w:jc w:val="left"/>
+      </w:tblPr>
+      <w:trPr>
+        <w:jc w:val="left"/>
+      </w:trPr>
+      <w:tcPr>
+        <w:tcBorders>
+          <w:bottom w:val="single" w:sz="0" w:space="0" w:color="auto"/>
+        </w:tcBorders>
+        <w:vAlign w:val="bottom"/>
+      </w:tcPr>
+    </w:tblStylePr>
+  </w:style>
+  <w:style w:type="paragraph" w:customStyle="1" w:styleId="DefinitionTerm">
+    <w:name w:val="Definition Term"/>
+    <w:basedOn w:val="Normal"/>
+    <w:next w:val="Definition"/>
+    <w:pPr>
+      <w:keepNext/>
+      <w:keepLines/>
+      <w:spacing w:after="0"/>
+    </w:pPr>
+    <w:rPr>
+      <w:b/>
+    </w:rPr>
+  </w:style>
+  <w:style w:type="paragraph" w:customStyle="1" w:styleId="Definition">
+    <w:name w:val="Definition"/>
+    <w:basedOn w:val="Normal"/>
+  </w:style>
+  <w:style w:type="paragraph" w:styleId="Legenda">
+    <w:name w:val="caption"/>
+    <w:basedOn w:val="Normal"/>
+    <w:link w:val="LegendaChar"/>
+    <w:pPr>
+      <w:spacing w:after="120"/>
+    </w:pPr>
+    <w:rPr>
+      <w:i/>
+    </w:rPr>
+  </w:style>
+  <w:style w:type="paragraph" w:customStyle="1" w:styleId="TableCaption">
+    <w:name w:val="Table Caption"/>
+    <w:basedOn w:val="Legenda"/>
+    <w:pPr>
+      <w:keepNext/>
+    </w:pPr>
+  </w:style>
+  <w:style w:type="paragraph" w:customStyle="1" w:styleId="ImageCaption">
+    <w:name w:val="Image Caption"/>
+    <w:basedOn w:val="Legenda"/>
+  </w:style>
+  <w:style w:type="paragraph" w:customStyle="1" w:styleId="Figure">
+    <w:name w:val="Figure"/>
+    <w:basedOn w:val="Normal"/>
+  </w:style>
+  <w:style w:type="paragraph" w:customStyle="1" w:styleId="CaptionedFigure">
+    <w:name w:val="Captioned Figure"/>
+    <w:basedOn w:val="Figure"/>
+    <w:pPr>
+      <w:keepNext/>
+    </w:pPr>
+  </w:style>
+  <w:style w:type="character" w:customStyle="1" w:styleId="LegendaChar">
+    <w:name w:val="Legenda Char"/>
+    <w:basedOn w:val="Fontepargpadro"/>
+    <w:link w:val="Legenda"/>
+  </w:style>
+  <w:style w:type="character" w:customStyle="1" w:styleId="VerbatimChar">
+    <w:name w:val="Verbatim Char"/>
+    <w:basedOn w:val="LegendaChar"/>
+    <w:link w:val="SourceCode"/>
+    <w:rPr>
+      <w:rFonts w:ascii="Consolas" w:hAnsi="Consolas"/>
+      <w:sz w:val="22"/>
+    </w:rPr>
+  </w:style>
+  <w:style w:type="character" w:customStyle="1" w:styleId="SectionNumber">
+    <w:name w:val="Section Number"/>
+    <w:basedOn w:val="LegendaChar"/>
+  </w:style>
+  <w:style w:type="character" w:styleId="Refdenotaderodap">
+    <w:name w:val="footnote reference"/>
+    <w:basedOn w:val="LegendaChar"/>
+    <w:rPr>
+      <w:vertAlign w:val="superscript"/>
+    </w:rPr>
+  </w:style>
+  <w:style w:type="character" w:styleId="Hyperlink">
+    <w:name w:val="Hyperlink"/>
+    <w:basedOn w:val="LegendaChar"/>
+    <w:uiPriority w:val="99"/>
+    <w:rPr>
+      <w:color w:val="4F81BD" w:themeColor="accent1"/>
+    </w:rPr>
+  </w:style>
+  <w:style w:type="paragraph" w:styleId="CabealhodoSumrio">
+    <w:name w:val="TOC Heading"/>
+    <w:basedOn w:val="Ttulo1"/>
+    <w:next w:val="Corpodetexto"/>
+    <w:uiPriority w:val="39"/>
+    <w:unhideWhenUsed/>
+    <w:qFormat/>
+    <w:pPr>
+      <w:spacing w:before="240" w:line="259" w:lineRule="auto"/>
+      <w:outlineLvl w:val="9"/>
+    </w:pPr>
+    <w:rPr>
+      <w:b w:val="0"/>
+      <w:bCs w:val="0"/>
+      <w:color w:val="365F91" w:themeColor="accent1" w:themeShade="BF"/>
+    </w:rPr>
+  </w:style>
+  <w:style w:type="paragraph" w:customStyle="1" w:styleId="SourceCode">
+    <w:name w:val="Source Code"/>
+    <w:basedOn w:val="Normal"/>
+    <w:link w:val="VerbatimChar"/>
+    <w:pPr>
+      <w:wordWrap w:val="0"/>
+    </w:pPr>
+  </w:style>
+  <w:style w:type="character" w:customStyle="1" w:styleId="KeywordTok">
+    <w:name w:val="KeywordTok"/>
+    <w:basedOn w:val="VerbatimChar"/>
+    <w:rPr>
+      <w:rFonts w:ascii="Consolas" w:hAnsi="Consolas"/>
+      <w:b/>
+      <w:color w:val="007020"/>
+      <w:sz w:val="22"/>
+    </w:rPr>
+  </w:style>
+  <w:style w:type="character" w:customStyle="1" w:styleId="DataTypeTok">
+    <w:name w:val="DataTypeTok"/>
+    <w:basedOn w:val="VerbatimChar"/>
+    <w:rPr>
+      <w:rFonts w:ascii="Consolas" w:hAnsi="Consolas"/>
+      <w:color w:val="902000"/>
+      <w:sz w:val="22"/>
+    </w:rPr>
+  </w:style>
+  <w:style w:type="character" w:customStyle="1" w:styleId="DecValTok">
+    <w:name w:val="DecValTok"/>
+    <w:basedOn w:val="VerbatimChar"/>
+    <w:rPr>
+      <w:rFonts w:ascii="Consolas" w:hAnsi="Consolas"/>
+      <w:color w:val="40A070"/>
+      <w:sz w:val="22"/>
+    </w:rPr>
+  </w:style>
+  <w:style w:type="character" w:customStyle="1" w:styleId="BaseNTok">
+    <w:name w:val="BaseNTok"/>
+    <w:basedOn w:val="VerbatimChar"/>
+    <w:rPr>
+      <w:rFonts w:ascii="Consolas" w:hAnsi="Consolas"/>
+      <w:color w:val="40A070"/>
+      <w:sz w:val="22"/>
+    </w:rPr>
+  </w:style>
+  <w:style w:type="character" w:customStyle="1" w:styleId="FloatTok">
+    <w:name w:val="FloatTok"/>
+    <w:basedOn w:val="VerbatimChar"/>
+    <w:rPr>
+      <w:rFonts w:ascii="Consolas" w:hAnsi="Consolas"/>
+      <w:color w:val="40A070"/>
+      <w:sz w:val="22"/>
+    </w:rPr>
+  </w:style>
+  <w:style w:type="character" w:customStyle="1" w:styleId="ConstantTok">
+    <w:name w:val="ConstantTok"/>
+    <w:basedOn w:val="VerbatimChar"/>
+    <w:rPr>
+      <w:rFonts w:ascii="Consolas" w:hAnsi="Consolas"/>
+      <w:color w:val="880000"/>
+      <w:sz w:val="22"/>
+    </w:rPr>
+  </w:style>
+  <w:style w:type="character" w:customStyle="1" w:styleId="CharTok">
+    <w:name w:val="CharTok"/>
+    <w:basedOn w:val="VerbatimChar"/>
+    <w:rPr>
+      <w:rFonts w:ascii="Consolas" w:hAnsi="Consolas"/>
+      <w:color w:val="4070A0"/>
+      <w:sz w:val="22"/>
+    </w:rPr>
+  </w:style>
+  <w:style w:type="character" w:customStyle="1" w:styleId="SpecialCharTok">
+    <w:name w:val="SpecialCharTok"/>
+    <w:basedOn w:val="VerbatimChar"/>
+    <w:rPr>
+      <w:rFonts w:ascii="Consolas" w:hAnsi="Consolas"/>
+      <w:color w:val="4070A0"/>
+      <w:sz w:val="22"/>
+    </w:rPr>
+  </w:style>
+  <w:style w:type="character" w:customStyle="1" w:styleId="StringTok">
+    <w:name w:val="StringTok"/>
+    <w:basedOn w:val="VerbatimChar"/>
+    <w:rPr>
+      <w:rFonts w:ascii="Consolas" w:hAnsi="Consolas"/>
+      <w:color w:val="4070A0"/>
+      <w:sz w:val="22"/>
+    </w:rPr>
+  </w:style>
+  <w:style w:type="character" w:customStyle="1" w:styleId="VerbatimStringTok">
+    <w:name w:val="VerbatimStringTok"/>
+    <w:basedOn w:val="VerbatimChar"/>
+    <w:rPr>
+      <w:rFonts w:ascii="Consolas" w:hAnsi="Consolas"/>
+      <w:color w:val="4070A0"/>
+      <w:sz w:val="22"/>
+    </w:rPr>
+  </w:style>
+  <w:style w:type="character" w:customStyle="1" w:styleId="SpecialStringTok">
+    <w:name w:val="SpecialStringTok"/>
+    <w:basedOn w:val="VerbatimChar"/>
+    <w:rPr>
+      <w:rFonts w:ascii="Consolas" w:hAnsi="Consolas"/>
+      <w:color w:val="BB6688"/>
+      <w:sz w:val="22"/>
+    </w:rPr>
+  </w:style>
+  <w:style w:type="character" w:customStyle="1" w:styleId="ImportTok">
+    <w:name w:val="ImportTok"/>
+    <w:basedOn w:val="VerbatimChar"/>
+    <w:rPr>
+      <w:rFonts w:ascii="Consolas" w:hAnsi="Consolas"/>
+      <w:b/>
+      <w:color w:val="008000"/>
+      <w:sz w:val="22"/>
+    </w:rPr>
+  </w:style>
+  <w:style w:type="character" w:customStyle="1" w:styleId="CommentTok">
+    <w:name w:val="CommentTok"/>
+    <w:basedOn w:val="VerbatimChar"/>
+    <w:rPr>
+      <w:rFonts w:ascii="Consolas" w:hAnsi="Consolas"/>
+      <w:i/>
+      <w:color w:val="60A0B0"/>
+      <w:sz w:val="22"/>
+    </w:rPr>
+  </w:style>
+  <w:style w:type="character" w:customStyle="1" w:styleId="DocumentationTok">
+    <w:name w:val="DocumentationTok"/>
+    <w:basedOn w:val="VerbatimChar"/>
+    <w:rPr>
+      <w:rFonts w:ascii="Consolas" w:hAnsi="Consolas"/>
+      <w:i/>
+      <w:color w:val="BA2121"/>
+      <w:sz w:val="22"/>
+    </w:rPr>
+  </w:style>
+  <w:style w:type="character" w:customStyle="1" w:styleId="AnnotationTok">
+    <w:name w:val="AnnotationTok"/>
+    <w:basedOn w:val="VerbatimChar"/>
+    <w:rPr>
+      <w:rFonts w:ascii="Consolas" w:hAnsi="Consolas"/>
+      <w:b/>
+      <w:i/>
+      <w:color w:val="60A0B0"/>
+      <w:sz w:val="22"/>
+    </w:rPr>
+  </w:style>
+  <w:style w:type="character" w:customStyle="1" w:styleId="CommentVarTok">
+    <w:name w:val="CommentVarTok"/>
+    <w:basedOn w:val="VerbatimChar"/>
+    <w:rPr>
+      <w:rFonts w:ascii="Consolas" w:hAnsi="Consolas"/>
+      <w:b/>
+      <w:i/>
+      <w:color w:val="60A0B0"/>
+      <w:sz w:val="22"/>
+    </w:rPr>
+  </w:style>
+  <w:style w:type="character" w:customStyle="1" w:styleId="OtherTok">
+    <w:name w:val="OtherTok"/>
+    <w:basedOn w:val="VerbatimChar"/>
+    <w:rPr>
+      <w:rFonts w:ascii="Consolas" w:hAnsi="Consolas"/>
+      <w:color w:val="007020"/>
+      <w:sz w:val="22"/>
+    </w:rPr>
+  </w:style>
+  <w:style w:type="character" w:customStyle="1" w:styleId="FunctionTok">
+    <w:name w:val="FunctionTok"/>
+    <w:basedOn w:val="VerbatimChar"/>
+    <w:rPr>
+      <w:rFonts w:ascii="Consolas" w:hAnsi="Consolas"/>
+      <w:color w:val="06287E"/>
+      <w:sz w:val="22"/>
+    </w:rPr>
+  </w:style>
+  <w:style w:type="character" w:customStyle="1" w:styleId="VariableTok">
+    <w:name w:val="VariableTok"/>
+    <w:basedOn w:val="VerbatimChar"/>
+    <w:rPr>
+      <w:rFonts w:ascii="Consolas" w:hAnsi="Consolas"/>
+      <w:color w:val="19177C"/>
+      <w:sz w:val="22"/>
+    </w:rPr>
+  </w:style>
+  <w:style w:type="character" w:customStyle="1" w:styleId="ControlFlowTok">
+    <w:name w:val="ControlFlowTok"/>
+    <w:basedOn w:val="VerbatimChar"/>
+    <w:rPr>
+      <w:rFonts w:ascii="Consolas" w:hAnsi="Consolas"/>
+      <w:b/>
+      <w:color w:val="007020"/>
+      <w:sz w:val="22"/>
+    </w:rPr>
+  </w:style>
+  <w:style w:type="character" w:customStyle="1" w:styleId="OperatorTok">
+    <w:name w:val="OperatorTok"/>
+    <w:basedOn w:val="VerbatimChar"/>
+    <w:rPr>
+      <w:rFonts w:ascii="Consolas" w:hAnsi="Consolas"/>
+      <w:color w:val="666666"/>
+      <w:sz w:val="22"/>
+    </w:rPr>
+  </w:style>
+  <w:style w:type="character" w:customStyle="1" w:styleId="BuiltInTok">
+    <w:name w:val="BuiltInTok"/>
+    <w:basedOn w:val="VerbatimChar"/>
+    <w:rPr>
+      <w:rFonts w:ascii="Consolas" w:hAnsi="Consolas"/>
+      <w:color w:val="008000"/>
+      <w:sz w:val="22"/>
+    </w:rPr>
+  </w:style>
+  <w:style w:type="character" w:customStyle="1" w:styleId="ExtensionTok">
+    <w:name w:val="ExtensionTok"/>
+    <w:basedOn w:val="VerbatimChar"/>
+    <w:rPr>
+      <w:rFonts w:ascii="Consolas" w:hAnsi="Consolas"/>
+      <w:sz w:val="22"/>
+    </w:rPr>
+  </w:style>
+  <w:style w:type="character" w:customStyle="1" w:styleId="PreprocessorTok">
+    <w:name w:val="PreprocessorTok"/>
+    <w:basedOn w:val="VerbatimChar"/>
+    <w:rPr>
+      <w:rFonts w:ascii="Consolas" w:hAnsi="Consolas"/>
+      <w:color w:val="BC7A00"/>
+      <w:sz w:val="22"/>
+    </w:rPr>
+  </w:style>
+  <w:style w:type="character" w:customStyle="1" w:styleId="AttributeTok">
+    <w:name w:val="AttributeTok"/>
+    <w:basedOn w:val="VerbatimChar"/>
+    <w:rPr>
+      <w:rFonts w:ascii="Consolas" w:hAnsi="Consolas"/>
+      <w:color w:val="7D9029"/>
+      <w:sz w:val="22"/>
+    </w:rPr>
+  </w:style>
+  <w:style w:type="character" w:customStyle="1" w:styleId="RegionMarkerTok">
+    <w:name w:val="RegionMarkerTok"/>
+    <w:basedOn w:val="VerbatimChar"/>
+    <w:rPr>
+      <w:rFonts w:ascii="Consolas" w:hAnsi="Consolas"/>
+      <w:sz w:val="22"/>
+    </w:rPr>
+  </w:style>
+  <w:style w:type="character" w:customStyle="1" w:styleId="InformationTok">
+    <w:name w:val="InformationTok"/>
+    <w:basedOn w:val="VerbatimChar"/>
+    <w:rPr>
+      <w:rFonts w:ascii="Consolas" w:hAnsi="Consolas"/>
+      <w:b/>
+      <w:i/>
+      <w:color w:val="60A0B0"/>
+      <w:sz w:val="22"/>
+    </w:rPr>
+  </w:style>
+  <w:style w:type="character" w:customStyle="1" w:styleId="WarningTok">
+    <w:name w:val="WarningTok"/>
+    <w:basedOn w:val="VerbatimChar"/>
+    <w:rPr>
+      <w:rFonts w:ascii="Consolas" w:hAnsi="Consolas"/>
+      <w:b/>
+      <w:i/>
+      <w:color w:val="60A0B0"/>
+      <w:sz w:val="22"/>
+    </w:rPr>
+  </w:style>
+  <w:style w:type="character" w:customStyle="1" w:styleId="AlertTok">
+    <w:name w:val="AlertTok"/>
+    <w:basedOn w:val="VerbatimChar"/>
+    <w:rPr>
+      <w:rFonts w:ascii="Consolas" w:hAnsi="Consolas"/>
+      <w:b/>
+      <w:color w:val="FF0000"/>
+      <w:sz w:val="22"/>
+    </w:rPr>
+  </w:style>
+  <w:style w:type="character" w:customStyle="1" w:styleId="ErrorTok">
+    <w:name w:val="ErrorTok"/>
+    <w:basedOn w:val="VerbatimChar"/>
+    <w:rPr>
+      <w:rFonts w:ascii="Consolas" w:hAnsi="Consolas"/>
+      <w:b/>
+      <w:color w:val="FF0000"/>
+      <w:sz w:val="22"/>
+    </w:rPr>
+  </w:style>
+  <w:style w:type="character" w:customStyle="1" w:styleId="NormalTok">
+    <w:name w:val="NormalTok"/>
+    <w:basedOn w:val="VerbatimChar"/>
+    <w:rPr>
+      <w:rFonts w:ascii="Consolas" w:hAnsi="Consolas"/>
+      <w:sz w:val="22"/>
+    </w:rPr>
+  </w:style>
+  <w:style w:type="paragraph" w:styleId="Sumrio1">
+    <w:name w:val="toc 1"/>
+    <w:basedOn w:val="Normal"/>
+    <w:next w:val="Normal"/>
+    <w:autoRedefine/>
+    <w:uiPriority w:val="39"/>
+    <w:rsid w:val="00C44609"/>
+    <w:pPr>
+      <w:spacing w:after="100"/>
+    </w:pPr>
+  </w:style>
+  <w:style w:type="paragraph" w:styleId="Sumrio2">
+    <w:name w:val="toc 2"/>
+    <w:basedOn w:val="Normal"/>
+    <w:next w:val="Normal"/>
+    <w:autoRedefine/>
+    <w:uiPriority w:val="39"/>
+    <w:rsid w:val="00C44609"/>
+    <w:pPr>
+      <w:spacing w:after="100"/>
+      <w:ind w:left="240"/>
+    </w:pPr>
+  </w:style>
+  <w:style w:type="paragraph" w:styleId="Textodebalo">
+    <w:name w:val="Balloon Text"/>
+    <w:basedOn w:val="Normal"/>
+    <w:link w:val="TextodebaloChar"/>
+    <w:rsid w:val="00C44609"/>
+    <w:pPr>
+      <w:spacing w:after="0"/>
+    </w:pPr>
+    <w:rPr>
+      <w:rFonts w:ascii="Tahoma" w:hAnsi="Tahoma" w:cs="Tahoma"/>
+      <w:sz w:val="16"/>
+      <w:szCs w:val="16"/>
+    </w:rPr>
+  </w:style>
+  <w:style w:type="character" w:customStyle="1" w:styleId="TextodebaloChar">
+    <w:name w:val="Texto de balão Char"/>
+    <w:basedOn w:val="Fontepargpadro"/>
+    <w:link w:val="Textodebalo"/>
+    <w:rsid w:val="00C44609"/>
+    <w:rPr>
+      <w:rFonts w:ascii="Tahoma" w:hAnsi="Tahoma" w:cs="Tahoma"/>
+      <w:sz w:val="16"/>
+      <w:szCs w:val="16"/>
+    </w:rPr>
   </w:style>
 </w:styles>
 </file>

</xml_diff>